<commit_message>
Update proposal document from actual WMS roadmap tab content
Rebuilt from the Future Roadmap tab in wms/index.html — all 20 Phase 2
modules (warehouse structure, receiving, QC, put-away, stock reservation,
picking, transport, labour, mobile, etc.) with correct completed/planned
status matching the help page.

https://claude.ai/code/session_016bAVLz9TDFvTo7m6M6ouEi
</commit_message>
<xml_diff>
--- a/WMS_Implementation_Proposal.docx
+++ b/WMS_Implementation_Proposal.docx
@@ -4,7 +4,7 @@
   <w:body>
     <w:p>
       <w:pPr>
-        <w:spacing w:before="1200" w:after="80"/>
+        <w:spacing w:before="1100" w:after="80"/>
         <w:jc w:val="center"/>
       </w:pPr>
       <w:r>
@@ -27,20 +27,21 @@
           <w:color w:val="2B6CB0"/>
           <w:sz w:val="32"/>
         </w:rPr>
-        <w:t>Oracle Fusion ERP Integration &amp; WMS Expansion</w:t>
+        <w:t>Full WMS Implementation Proposal</w:t>
       </w:r>
     </w:p>
     <w:p>
       <w:pPr>
-        <w:spacing w:after="1200"/>
+        <w:spacing w:after="1000"/>
         <w:jc w:val="center"/>
       </w:pPr>
       <w:r>
         <w:rPr>
+          <w:i/>
           <w:color w:val="64748B"/>
-          <w:sz w:val="28"/>
+          <w:sz w:val="26"/>
         </w:rPr>
-        <w:t>Implementation Proposal</w:t>
+        <w:t>Phase 2 Complete — From Current 40% to 100%</w:t>
       </w:r>
     </w:p>
     <w:tbl>
@@ -145,7 +146,7 @@
               <w:rPr>
                 <w:sz w:val="20"/>
               </w:rPr>
-              <w:t>Professional Services — Fixed Monthly Rate</w:t>
+              <w:t>Professional Services — Monthly Rate</w:t>
             </w:r>
           </w:p>
         </w:tc>
@@ -190,13 +191,13 @@
     </w:p>
     <w:p>
       <w:pPr>
-        <w:spacing w:before="360" w:after="120"/>
+        <w:spacing w:before="320" w:after="120"/>
       </w:pPr>
       <w:r>
         <w:rPr>
           <w:b/>
           <w:color w:val="1E3A5F"/>
-          <w:sz w:val="36"/>
+          <w:sz w:val="34"/>
         </w:rPr>
         <w:t>1. Executive Summary</w:t>
       </w:r>
@@ -208,10 +209,9 @@
       <w:r>
         <w:rPr>
           <w:b w:val="0"/>
-          <w:i w:val="0"/>
           <w:sz w:val="21"/>
         </w:rPr>
-        <w:t>This proposal outlines a structured six-month engagement to expand and integrate Gray's Warehouse Management System (WMS) with Oracle Fusion ERP. The project delivers end-to-end visibility across Finance (GL, AP, AR, FA), Order Management (OM), and Operations (WMS, POS, Inventory Sync), replacing manual processes with a unified, real-time desktop-web application.</w:t>
+        <w:t>Gray's WMS is currently live with Phase 1 — core warehouse, shipping, printing, and Oracle Fusion integration — achieving 75% completion of Phase 1 features and 40% overall. This proposal covers the remaining work to bring the system to full maturity: completing Phase 1 in-progress items and delivering all Phase 2 modules (warehouse structure, receiving, QC, put-away, inventory, picking, dispatch, transport, returns, KPIs, labour management, and mobile devices).</w:t>
       </w:r>
     </w:p>
     <w:p>
@@ -221,10 +221,9 @@
       <w:r>
         <w:rPr>
           <w:b w:val="0"/>
-          <w:i w:val="0"/>
           <w:sz w:val="21"/>
         </w:rPr>
-        <w:t>Modules will be released individually as they are completed — providing immediate business value without waiting for the full six-month timeline. An on-site implementation phase of two months covers user training, go-live support, and data migration for each module.</w:t>
+        <w:t>Modules are delivered individually as they complete, so the business gains value continuously rather than waiting for the full six-month project to finish. Two months of on-site presence are included for go-live support, user training, and data migration.</w:t>
       </w:r>
     </w:p>
     <w:tbl>
@@ -310,7 +309,7 @@
                 <w:color w:val="FFFFFF"/>
                 <w:sz w:val="26"/>
               </w:rPr>
-              <w:t>$250 / Day</w:t>
+              <w:t>$250/Day</w:t>
               <w:br/>
             </w:r>
             <w:r>
@@ -337,7 +336,7 @@
                 <w:color w:val="FFFFFF"/>
                 <w:sz w:val="26"/>
               </w:rPr>
-              <w:t>$7,500 / Mo</w:t>
+              <w:t>$7,500/Mo</w:t>
               <w:br/>
             </w:r>
             <w:r>
@@ -353,15 +352,15 @@
     </w:tbl>
     <w:p>
       <w:pPr>
-        <w:spacing w:before="360" w:after="120"/>
+        <w:spacing w:before="320" w:after="120"/>
       </w:pPr>
       <w:r>
         <w:rPr>
           <w:b/>
           <w:color w:val="1E3A5F"/>
-          <w:sz w:val="36"/>
+          <w:sz w:val="34"/>
         </w:rPr>
-        <w:t>2. Current System Overview</w:t>
+        <w:t>2. Current System Status</w:t>
       </w:r>
     </w:p>
     <w:p>
@@ -371,23 +370,22 @@
       <w:r>
         <w:rPr>
           <w:b w:val="0"/>
-          <w:i w:val="0"/>
           <w:sz w:val="21"/>
         </w:rPr>
-        <w:t>The existing WMS is a C#/.NET 8.0 Windows Forms application hosting a WebView2 (Chromium) browser control. The frontend is built with HTML5, JavaScript, jQuery, and DevExtreme components, communicating with Oracle APEX REST APIs.</w:t>
+        <w:t>The current WMS is a C#/.NET 8.0 Windows Forms application with a WebView2 frontend, communicating with Oracle APEX REST APIs and Oracle Fusion via BIP SOAP.</w:t>
       </w:r>
     </w:p>
     <w:p>
       <w:pPr>
-        <w:spacing w:before="360" w:after="120"/>
+        <w:spacing w:before="200" w:after="80"/>
       </w:pPr>
       <w:r>
         <w:rPr>
           <w:b/>
-          <w:color w:val="1E3A5F"/>
-          <w:sz w:val="28"/>
+          <w:color w:val="2B6CB0"/>
+          <w:sz w:val="26"/>
         </w:rPr>
-        <w:t>Operational Modules (Live)</w:t>
+        <w:t>Phase 1 — Completed Features (19/25)</w:t>
       </w:r>
     </w:p>
     <w:p>
@@ -400,7 +398,7 @@
         <w:rPr>
           <w:sz w:val="21"/>
         </w:rPr>
-        <w:t>Trip Management — Create, manage, and dispatch delivery trips with order assignment.</w:t>
+        <w:t>Trip Management with multi-tab interface</w:t>
       </w:r>
     </w:p>
     <w:p>
@@ -413,7 +411,7 @@
         <w:rPr>
           <w:sz w:val="21"/>
         </w:rPr>
-        <w:t>Shipment Agent — Automated print scheduling, Oracle Fusion PDF download via BIP SOAP, line-count validation.</w:t>
+        <w:t>Vehicle and Picker Management</w:t>
       </w:r>
     </w:p>
     <w:p>
@@ -426,7 +424,7 @@
         <w:rPr>
           <w:sz w:val="21"/>
         </w:rPr>
-        <w:t>Printer Management — Multi-printer configuration, job queue, and real-time print monitoring.</w:t>
+        <w:t>Oracle Fusion Integration (REST + BIP SOAP)</w:t>
       </w:r>
     </w:p>
     <w:p>
@@ -439,7 +437,7 @@
         <w:rPr>
           <w:sz w:val="21"/>
         </w:rPr>
-        <w:t>Inventory Management — Stock enquiry and movement tracking via Oracle Fusion REST.</w:t>
+        <w:t>Pick Release and Lot Allocation</w:t>
       </w:r>
     </w:p>
     <w:p>
@@ -452,7 +450,7 @@
         <w:rPr>
           <w:sz w:val="21"/>
         </w:rPr>
-        <w:t>Receiving — Inbound goods processing linked to purchase orders.</w:t>
+        <w:t>Print Management System (Printer config, job queue, monitoring)</w:t>
       </w:r>
     </w:p>
     <w:p>
@@ -465,20 +463,267 @@
         <w:rPr>
           <w:sz w:val="21"/>
         </w:rPr>
-        <w:t>Claude AI Integration — Embedded AI assistant for WMS queries and task guidance.</w:t>
+        <w:t>Real-time fetching of pending Sales Orders and Store Requests</w:t>
       </w:r>
     </w:p>
     <w:p>
       <w:pPr>
-        <w:spacing w:before="360" w:after="120"/>
+        <w:pStyle w:val="ListBullet"/>
+        <w:spacing w:after="60"/>
+        <w:ind w:left="432"/>
+      </w:pPr>
+      <w:r>
+        <w:rPr>
+          <w:sz w:val="21"/>
+        </w:rPr>
+        <w:t>Assignment of Pickers, Lorries, Priorities, and Loading Bay</w:t>
+      </w:r>
+    </w:p>
+    <w:p>
+      <w:pPr>
+        <w:pStyle w:val="ListBullet"/>
+        <w:spacing w:after="60"/>
+        <w:ind w:left="432"/>
+      </w:pPr>
+      <w:r>
+        <w:rPr>
+          <w:sz w:val="21"/>
+        </w:rPr>
+        <w:t>Picking and Putaway via Mobile Applications</w:t>
+      </w:r>
+    </w:p>
+    <w:p>
+      <w:pPr>
+        <w:pStyle w:val="ListBullet"/>
+        <w:spacing w:after="60"/>
+        <w:ind w:left="432"/>
+      </w:pPr>
+      <w:r>
+        <w:rPr>
+          <w:sz w:val="21"/>
+        </w:rPr>
+        <w:t>Ship Confirmation of Orders</w:t>
+      </w:r>
+    </w:p>
+    <w:p>
+      <w:pPr>
+        <w:pStyle w:val="ListBullet"/>
+        <w:spacing w:after="60"/>
+        <w:ind w:left="432"/>
+      </w:pPr>
+      <w:r>
+        <w:rPr>
+          <w:sz w:val="21"/>
+        </w:rPr>
+        <w:t>Loading Verification via Mobile Applications</w:t>
+      </w:r>
+    </w:p>
+    <w:p>
+      <w:pPr>
+        <w:pStyle w:val="ListBullet"/>
+        <w:spacing w:after="60"/>
+        <w:ind w:left="432"/>
+      </w:pPr>
+      <w:r>
+        <w:rPr>
+          <w:sz w:val="21"/>
+        </w:rPr>
+        <w:t>Real-time update of Picking/Shipping status into Oracle Fusion</w:t>
+      </w:r>
+    </w:p>
+    <w:p>
+      <w:pPr>
+        <w:pStyle w:val="ListBullet"/>
+        <w:spacing w:after="60"/>
+        <w:ind w:left="432"/>
+      </w:pPr>
+      <w:r>
+        <w:rPr>
+          <w:sz w:val="21"/>
+        </w:rPr>
+        <w:t>Printing Orders (Shipment Agent with line-count validation)</w:t>
+      </w:r>
+    </w:p>
+    <w:p>
+      <w:pPr>
+        <w:pStyle w:val="ListBullet"/>
+        <w:spacing w:after="60"/>
+        <w:ind w:left="432"/>
+      </w:pPr>
+      <w:r>
+        <w:rPr>
+          <w:sz w:val="21"/>
+        </w:rPr>
+        <w:t>Vehicle Analytics Dashboard and KPI Cards</w:t>
+      </w:r>
+    </w:p>
+    <w:p>
+      <w:pPr>
+        <w:pStyle w:val="ListBullet"/>
+        <w:spacing w:after="60"/>
+        <w:ind w:left="432"/>
+      </w:pPr>
+      <w:r>
+        <w:rPr>
+          <w:sz w:val="21"/>
+        </w:rPr>
+        <w:t>Mobile App for Pickers with Barcode/QR scanning</w:t>
+      </w:r>
+    </w:p>
+    <w:p>
+      <w:pPr>
+        <w:pStyle w:val="ListBullet"/>
+        <w:spacing w:after="60"/>
+        <w:ind w:left="432"/>
+      </w:pPr>
+      <w:r>
+        <w:rPr>
+          <w:sz w:val="21"/>
+        </w:rPr>
+        <w:t>Role-based permissions</w:t>
+      </w:r>
+    </w:p>
+    <w:p>
+      <w:pPr>
+        <w:pStyle w:val="ListBullet"/>
+        <w:spacing w:after="60"/>
+        <w:ind w:left="432"/>
+      </w:pPr>
+      <w:r>
+        <w:rPr>
+          <w:sz w:val="21"/>
+        </w:rPr>
+        <w:t>Real-time stock levels by warehouse, location, product, lot, expiry</w:t>
+      </w:r>
+    </w:p>
+    <w:p>
+      <w:pPr>
+        <w:pStyle w:val="ListBullet"/>
+        <w:spacing w:after="60"/>
+        <w:ind w:left="432"/>
+      </w:pPr>
+      <w:r>
+        <w:rPr>
+          <w:sz w:val="21"/>
+        </w:rPr>
+        <w:t>Lot traceability (FEFO), full movement history, cycle counting</w:t>
+      </w:r>
+    </w:p>
+    <w:p>
+      <w:pPr>
+        <w:pStyle w:val="ListBullet"/>
+        <w:spacing w:after="60"/>
+        <w:ind w:left="432"/>
+      </w:pPr>
+      <w:r>
+        <w:rPr>
+          <w:sz w:val="21"/>
+        </w:rPr>
+        <w:t>Oracle ERP integration for financials &amp; order management</w:t>
+      </w:r>
+    </w:p>
+    <w:p>
+      <w:pPr>
+        <w:pStyle w:val="ListBullet"/>
+        <w:spacing w:after="60"/>
+        <w:ind w:left="432"/>
+      </w:pPr>
+      <w:r>
+        <w:rPr>
+          <w:sz w:val="21"/>
+        </w:rPr>
+        <w:t>Auto shipping documents (invoices, STV, delivery notes)</w:t>
+      </w:r>
+    </w:p>
+    <w:p>
+      <w:pPr>
+        <w:spacing w:before="200" w:after="80"/>
+      </w:pPr>
+      <w:r>
+        <w:rPr>
+          <w:b/>
+          <w:color w:val="2B6CB0"/>
+          <w:sz w:val="26"/>
+        </w:rPr>
+        <w:t>Phase 1 — Remaining (6 items — In Progress / Planned)</w:t>
+      </w:r>
+    </w:p>
+    <w:p>
+      <w:pPr>
+        <w:pStyle w:val="ListBullet"/>
+        <w:spacing w:after="60"/>
+        <w:ind w:left="432"/>
+      </w:pPr>
+      <w:r>
+        <w:rPr>
+          <w:sz w:val="21"/>
+        </w:rPr>
+        <w:t>Advanced Reporting Module (In Progress)</w:t>
+      </w:r>
+    </w:p>
+    <w:p>
+      <w:pPr>
+        <w:pStyle w:val="ListBullet"/>
+        <w:spacing w:after="60"/>
+        <w:ind w:left="432"/>
+      </w:pPr>
+      <w:r>
+        <w:rPr>
+          <w:sz w:val="21"/>
+        </w:rPr>
+        <w:t>Custom Dashboard Builder (Planned)</w:t>
+      </w:r>
+    </w:p>
+    <w:p>
+      <w:pPr>
+        <w:pStyle w:val="ListBullet"/>
+        <w:spacing w:after="60"/>
+        <w:ind w:left="432"/>
+      </w:pPr>
+      <w:r>
+        <w:rPr>
+          <w:sz w:val="21"/>
+        </w:rPr>
+        <w:t>Performance Metrics Tracking (Planned)</w:t>
+      </w:r>
+    </w:p>
+    <w:p>
+      <w:pPr>
+        <w:pStyle w:val="ListBullet"/>
+        <w:spacing w:after="60"/>
+        <w:ind w:left="432"/>
+      </w:pPr>
+      <w:r>
+        <w:rPr>
+          <w:sz w:val="21"/>
+        </w:rPr>
+        <w:t>Customer Delivery Notifications (Planned)</w:t>
+      </w:r>
+    </w:p>
+    <w:p>
+      <w:pPr>
+        <w:pStyle w:val="ListBullet"/>
+        <w:spacing w:after="60"/>
+        <w:ind w:left="432"/>
+      </w:pPr>
+      <w:r>
+        <w:rPr>
+          <w:sz w:val="21"/>
+        </w:rPr>
+        <w:t>Third-party Carrier Integration (Planned)</w:t>
+      </w:r>
+    </w:p>
+    <w:p>
+      <w:pPr>
+        <w:spacing w:before="320" w:after="120"/>
       </w:pPr>
       <w:r>
         <w:rPr>
           <w:b/>
           <w:color w:val="1E3A5F"/>
-          <w:sz w:val="36"/>
+          <w:sz w:val="34"/>
         </w:rPr>
-        <w:t>3. Proposed Roadmap Modules</w:t>
+        <w:t>3. Phase 2 — Full WMS Requirements (Proposed)</w:t>
       </w:r>
     </w:p>
     <w:p>
@@ -488,17 +733,15 @@
       <w:r>
         <w:rPr>
           <w:b w:val="0"/>
-          <w:i w:val="0"/>
           <w:sz w:val="21"/>
         </w:rPr>
-        <w:t>The following modules are proposed for development. Each module is self-contained and will be released upon completion, enabling the business to adopt functionality incrementally.</w:t>
+        <w:t>The following modules form the complete Phase 2 scope, aligned directly with the WMS roadmap defined in the application's help page. Each module is self-contained and will be released upon passing user acceptance testing.</w:t>
       </w:r>
     </w:p>
     <w:tbl>
       <w:tblPr>
         <w:tblStyle w:val="TableGrid"/>
         <w:tblW w:type="auto" w:w="0"/>
-        <w:jc w:val="left"/>
         <w:tblLook w:firstColumn="1" w:firstRow="1" w:lastColumn="0" w:lastRow="0" w:noHBand="0" w:noVBand="1" w:val="04A0"/>
       </w:tblPr>
       <w:tblGrid>
@@ -517,7 +760,7 @@
               <w:rPr>
                 <w:b/>
                 <w:color w:val="FFFFFF"/>
-                <w:sz w:val="20"/>
+                <w:sz w:val="18"/>
               </w:rPr>
               <w:t>Module</w:t>
             </w:r>
@@ -533,9 +776,9 @@
               <w:rPr>
                 <w:b/>
                 <w:color w:val="FFFFFF"/>
-                <w:sz w:val="20"/>
+                <w:sz w:val="18"/>
               </w:rPr>
-              <w:t>Name</w:t>
+              <w:t>Key Features</w:t>
             </w:r>
           </w:p>
         </w:tc>
@@ -549,9 +792,9 @@
               <w:rPr>
                 <w:b/>
                 <w:color w:val="FFFFFF"/>
-                <w:sz w:val="20"/>
+                <w:sz w:val="18"/>
               </w:rPr>
-              <w:t>Scope</w:t>
+              <w:t>Status</w:t>
             </w:r>
           </w:p>
         </w:tc>
@@ -565,9 +808,10 @@
           <w:p>
             <w:r>
               <w:rPr>
-                <w:sz w:val="20"/>
+                <w:b/>
+                <w:sz w:val="18"/>
               </w:rPr>
-              <w:t>M1</w:t>
+              <w:t>AI &amp; Optimization</w:t>
             </w:r>
           </w:p>
         </w:tc>
@@ -579,10 +823,9 @@
           <w:p>
             <w:r>
               <w:rPr>
-                <w:b/>
-                <w:sz w:val="20"/>
+                <w:sz w:val="17"/>
               </w:rPr>
-              <w:t>General Ledger (GL)</w:t>
+              <w:t>AI Readiness framework, Intelligent Picker Assignment using AI, Automated Exception Handling...</w:t>
             </w:r>
           </w:p>
         </w:tc>
@@ -594,9 +837,10 @@
           <w:p>
             <w:r>
               <w:rPr>
-                <w:sz w:val="19"/>
+                <w:color w:val="92400E"/>
+                <w:sz w:val="18"/>
               </w:rPr>
-              <w:t>Journal entry review, trial balance, period close management integrated with Oracle Fusion GL.</w:t>
+              <w:t>Planned</w:t>
             </w:r>
           </w:p>
         </w:tc>
@@ -610,9 +854,10 @@
           <w:p>
             <w:r>
               <w:rPr>
-                <w:sz w:val="20"/>
+                <w:b/>
+                <w:sz w:val="18"/>
               </w:rPr>
-              <w:t>M2</w:t>
+              <w:t>Warehouse Structure &amp; Locations</w:t>
             </w:r>
           </w:p>
         </w:tc>
@@ -624,10 +869,9 @@
           <w:p>
             <w:r>
               <w:rPr>
-                <w:b/>
-                <w:sz w:val="20"/>
+                <w:sz w:val="17"/>
               </w:rPr>
-              <w:t>Accounts Payable (AP)</w:t>
+              <w:t>Manage multiple warehouses: Bonded, Duty-Paid, Pharmacy, Cosmetics, RAWS, Triage, Track stock separately for bonded vs. duty-paid status, Support storage types: drive-in racking, selective, double-deep, floor, cold storage...</w:t>
             </w:r>
           </w:p>
         </w:tc>
@@ -639,9 +883,10 @@
           <w:p>
             <w:r>
               <w:rPr>
-                <w:sz w:val="19"/>
+                <w:color w:val="92400E"/>
+                <w:sz w:val="18"/>
               </w:rPr>
-              <w:t>Invoice capture, approval workflow, payment scheduling, and supplier reconciliation.</w:t>
+              <w:t>Planned</w:t>
             </w:r>
           </w:p>
         </w:tc>
@@ -655,9 +900,10 @@
           <w:p>
             <w:r>
               <w:rPr>
-                <w:sz w:val="20"/>
+                <w:b/>
+                <w:sz w:val="18"/>
               </w:rPr>
-              <w:t>M3</w:t>
+              <w:t>Receiving Goods</w:t>
             </w:r>
           </w:p>
         </w:tc>
@@ -669,10 +915,9 @@
           <w:p>
             <w:r>
               <w:rPr>
-                <w:b/>
-                <w:sz w:val="20"/>
+                <w:sz w:val="17"/>
               </w:rPr>
-              <w:t>Accounts Receivable (AR)</w:t>
+              <w:t>Scan barcodes/QR codes at receipt (pallets, boxes, units), Auto-check received quantities against purchase orders, Handle partial and over-receipts...</w:t>
             </w:r>
           </w:p>
         </w:tc>
@@ -684,9 +929,10 @@
           <w:p>
             <w:r>
               <w:rPr>
-                <w:sz w:val="19"/>
+                <w:color w:val="92400E"/>
+                <w:sz w:val="18"/>
               </w:rPr>
-              <w:t>Customer invoicing, receipt matching, aging reports, and dunning management.</w:t>
+              <w:t>Planned</w:t>
             </w:r>
           </w:p>
         </w:tc>
@@ -700,9 +946,10 @@
           <w:p>
             <w:r>
               <w:rPr>
-                <w:sz w:val="20"/>
+                <w:b/>
+                <w:sz w:val="18"/>
               </w:rPr>
-              <w:t>M4</w:t>
+              <w:t>Quality Control</w:t>
             </w:r>
           </w:p>
         </w:tc>
@@ -714,10 +961,9 @@
           <w:p>
             <w:r>
               <w:rPr>
-                <w:b/>
-                <w:sz w:val="20"/>
+                <w:sz w:val="17"/>
               </w:rPr>
-              <w:t>Fixed Assets (FA)</w:t>
+              <w:t>Set QC rules by product, supplier, or shipment, Flag items as Non-Conform or On Hold on inspection failure, Digital inspection checklists...</w:t>
             </w:r>
           </w:p>
         </w:tc>
@@ -729,9 +975,10 @@
           <w:p>
             <w:r>
               <w:rPr>
-                <w:sz w:val="19"/>
+                <w:color w:val="92400E"/>
+                <w:sz w:val="18"/>
               </w:rPr>
-              <w:t>Asset register, depreciation schedules, additions/disposals linked to Oracle Fusion FA.</w:t>
+              <w:t>Planned</w:t>
             </w:r>
           </w:p>
         </w:tc>
@@ -745,9 +992,10 @@
           <w:p>
             <w:r>
               <w:rPr>
-                <w:sz w:val="20"/>
+                <w:b/>
+                <w:sz w:val="18"/>
               </w:rPr>
-              <w:t>M5</w:t>
+              <w:t>Put-Away</w:t>
             </w:r>
           </w:p>
         </w:tc>
@@ -759,10 +1007,9 @@
           <w:p>
             <w:r>
               <w:rPr>
-                <w:b/>
-                <w:sz w:val="20"/>
+                <w:sz w:val="17"/>
               </w:rPr>
-              <w:t>Order Management (OM)</w:t>
+              <w:t>WMS-determined optimal location based on predefined rules, FIFO / FEFO / LIFO / ABC / zone-based storage strategies, Size, weight, hazardous materials &amp; temperature rules...</w:t>
             </w:r>
           </w:p>
         </w:tc>
@@ -774,9 +1021,10 @@
           <w:p>
             <w:r>
               <w:rPr>
-                <w:sz w:val="19"/>
+                <w:color w:val="92400E"/>
+                <w:sz w:val="18"/>
               </w:rPr>
-              <w:t>End-to-end sales order lifecycle — entry, fulfilment, shipping confirmation, and invoicing.</w:t>
+              <w:t>Planned</w:t>
             </w:r>
           </w:p>
         </w:tc>
@@ -790,9 +1038,10 @@
           <w:p>
             <w:r>
               <w:rPr>
-                <w:sz w:val="20"/>
+                <w:b/>
+                <w:sz w:val="18"/>
               </w:rPr>
-              <w:t>M6</w:t>
+              <w:t>Inventory Management (Enhancements)</w:t>
             </w:r>
           </w:p>
         </w:tc>
@@ -804,10 +1053,9 @@
           <w:p>
             <w:r>
               <w:rPr>
-                <w:b/>
-                <w:sz w:val="20"/>
+                <w:sz w:val="17"/>
               </w:rPr>
-              <w:t>Cash &amp; Bank (CA)</w:t>
+              <w:t>Replenishment triggers: at sight, minimum stock level, picking wave launch, Alerts for picking minimum levels &amp; approaching expiry dates...</w:t>
             </w:r>
           </w:p>
         </w:tc>
@@ -819,9 +1067,10 @@
           <w:p>
             <w:r>
               <w:rPr>
-                <w:sz w:val="19"/>
+                <w:color w:val="92400E"/>
+                <w:sz w:val="18"/>
               </w:rPr>
-              <w:t>Bank statement import, reconciliation, petty cash, and treasury position dashboard.</w:t>
+              <w:t>Planned</w:t>
             </w:r>
           </w:p>
         </w:tc>
@@ -835,9 +1084,10 @@
           <w:p>
             <w:r>
               <w:rPr>
-                <w:sz w:val="20"/>
+                <w:b/>
+                <w:sz w:val="18"/>
               </w:rPr>
-              <w:t>M7</w:t>
+              <w:t>Stock Reservation</w:t>
             </w:r>
           </w:p>
         </w:tc>
@@ -849,10 +1099,9 @@
           <w:p>
             <w:r>
               <w:rPr>
-                <w:b/>
-                <w:sz w:val="20"/>
+                <w:sz w:val="17"/>
               </w:rPr>
-              <w:t>Point of Sale (POS)</w:t>
+              <w:t>Reserve stock for specific customers or orders, Show available vs. reserved stock separately, Prevent picking reserved stock for other customers...</w:t>
             </w:r>
           </w:p>
         </w:tc>
@@ -864,9 +1113,10 @@
           <w:p>
             <w:r>
               <w:rPr>
-                <w:sz w:val="19"/>
+                <w:color w:val="92400E"/>
+                <w:sz w:val="18"/>
               </w:rPr>
-              <w:t>Retail/counter sales with barcode scanning, cash drawer, and real-time Oracle Fusion sync.</w:t>
+              <w:t>Planned</w:t>
             </w:r>
           </w:p>
         </w:tc>
@@ -880,9 +1130,10 @@
           <w:p>
             <w:r>
               <w:rPr>
-                <w:sz w:val="20"/>
+                <w:b/>
+                <w:sz w:val="18"/>
               </w:rPr>
-              <w:t>M8</w:t>
+              <w:t>Order Management (Enhancements)</w:t>
             </w:r>
           </w:p>
         </w:tc>
@@ -894,10 +1145,9 @@
           <w:p>
             <w:r>
               <w:rPr>
-                <w:b/>
-                <w:sz w:val="20"/>
+                <w:sz w:val="17"/>
               </w:rPr>
-              <w:t>Data Synchronisation</w:t>
+              <w:t>Receive orders directly from customers via EDI &amp; e-commerce, Split orders: full pallets vs. less-than-full pallets...</w:t>
             </w:r>
           </w:p>
         </w:tc>
@@ -909,9 +1159,10 @@
           <w:p>
             <w:r>
               <w:rPr>
-                <w:sz w:val="19"/>
+                <w:color w:val="92400E"/>
+                <w:sz w:val="18"/>
               </w:rPr>
-              <w:t>Scheduled and on-demand bi-directional sync between WMS local storage and Oracle Fusion.</w:t>
+              <w:t>Planned</w:t>
             </w:r>
           </w:p>
         </w:tc>
@@ -925,9 +1176,10 @@
           <w:p>
             <w:r>
               <w:rPr>
-                <w:sz w:val="20"/>
+                <w:b/>
+                <w:sz w:val="18"/>
               </w:rPr>
-              <w:t>M9</w:t>
+              <w:t>Picking (Enhancements)</w:t>
             </w:r>
           </w:p>
         </w:tc>
@@ -939,10 +1191,9 @@
           <w:p>
             <w:r>
               <w:rPr>
-                <w:b/>
-                <w:sz w:val="20"/>
+                <w:sz w:val="17"/>
               </w:rPr>
-              <w:t>Reporting &amp; Analytics</w:t>
+              <w:t>Picking methods: single order, batch, zone, wave, cross-docking, Optimize picking routes to minimize travel time, Verify picked items by scanning; handle short picks...</w:t>
             </w:r>
           </w:p>
         </w:tc>
@@ -954,9 +1205,10 @@
           <w:p>
             <w:r>
               <w:rPr>
-                <w:sz w:val="19"/>
+                <w:color w:val="92400E"/>
+                <w:sz w:val="18"/>
               </w:rPr>
-              <w:t>Cross-module dashboards, KPI widgets, and exportable Excel/PDF reports.</w:t>
+              <w:t>Planned</w:t>
             </w:r>
           </w:p>
         </w:tc>
@@ -970,9 +1222,10 @@
           <w:p>
             <w:r>
               <w:rPr>
-                <w:sz w:val="20"/>
+                <w:b/>
+                <w:sz w:val="18"/>
               </w:rPr>
-              <w:t>M10</w:t>
+              <w:t>Loading &amp; Dispatch (Enhancements)</w:t>
             </w:r>
           </w:p>
         </w:tc>
@@ -984,10 +1237,9 @@
           <w:p>
             <w:r>
               <w:rPr>
-                <w:b/>
-                <w:sz w:val="20"/>
+                <w:sz w:val="17"/>
               </w:rPr>
-              <w:t>Mobile Companion</w:t>
+              <w:t>Optimize loading sequence; verify quantities by scanning, Assign orders to vehicles &amp; drivers; check vehicle capacity, Delivery by pallets consolidation...</w:t>
             </w:r>
           </w:p>
         </w:tc>
@@ -999,25 +1251,491 @@
           <w:p>
             <w:r>
               <w:rPr>
-                <w:sz w:val="19"/>
+                <w:color w:val="92400E"/>
+                <w:sz w:val="18"/>
               </w:rPr>
-              <w:t>Progressive Web App (PWA) for warehouse staff — picking, putaway, and cycle counts.</w:t>
+              <w:t>Planned</w:t>
+            </w:r>
+          </w:p>
+        </w:tc>
+      </w:tr>
+      <w:tr>
+        <w:tc>
+          <w:tcPr>
+            <w:tcW w:type="dxa" w:w="3135"/>
+            <w:shd w:val="clear" w:color="auto" w:fill="f0f4fa"/>
+          </w:tcPr>
+          <w:p>
+            <w:r>
+              <w:rPr>
+                <w:b/>
+                <w:sz w:val="18"/>
+              </w:rPr>
+              <w:t>Shipping (Enhancements)</w:t>
+            </w:r>
+          </w:p>
+        </w:tc>
+        <w:tc>
+          <w:tcPr>
+            <w:tcW w:type="dxa" w:w="3135"/>
+            <w:shd w:val="clear" w:color="auto" w:fill="f0f4fa"/>
+          </w:tcPr>
+          <w:p>
+            <w:r>
+              <w:rPr>
+                <w:sz w:val="17"/>
+              </w:rPr>
+              <w:t>Automatic customer notifications when orders ship, Track proof of delivery (POD) with signatures and photos...</w:t>
+            </w:r>
+          </w:p>
+        </w:tc>
+        <w:tc>
+          <w:tcPr>
+            <w:tcW w:type="dxa" w:w="3135"/>
+            <w:shd w:val="clear" w:color="auto" w:fill="f0f4fa"/>
+          </w:tcPr>
+          <w:p>
+            <w:r>
+              <w:rPr>
+                <w:color w:val="92400E"/>
+                <w:sz w:val="18"/>
+              </w:rPr>
+              <w:t>Planned</w:t>
+            </w:r>
+          </w:p>
+        </w:tc>
+      </w:tr>
+      <w:tr>
+        <w:tc>
+          <w:tcPr>
+            <w:tcW w:type="dxa" w:w="3135"/>
+            <w:shd w:val="clear" w:color="auto" w:fill="ffffff"/>
+          </w:tcPr>
+          <w:p>
+            <w:r>
+              <w:rPr>
+                <w:b/>
+                <w:sz w:val="18"/>
+              </w:rPr>
+              <w:t>Returns &amp; Reverse Logistics</w:t>
+            </w:r>
+          </w:p>
+        </w:tc>
+        <w:tc>
+          <w:tcPr>
+            <w:tcW w:type="dxa" w:w="3135"/>
+            <w:shd w:val="clear" w:color="auto" w:fill="ffffff"/>
+          </w:tcPr>
+          <w:p>
+            <w:r>
+              <w:rPr>
+                <w:sz w:val="17"/>
+              </w:rPr>
+              <w:t>Handle empty bottle/crate returns with quantity tracking, Track deposit refunds for returnable packaging, Disposition decisions: destroy, rework, braderie, hazardous, ADV...</w:t>
+            </w:r>
+          </w:p>
+        </w:tc>
+        <w:tc>
+          <w:tcPr>
+            <w:tcW w:type="dxa" w:w="3135"/>
+            <w:shd w:val="clear" w:color="auto" w:fill="ffffff"/>
+          </w:tcPr>
+          <w:p>
+            <w:r>
+              <w:rPr>
+                <w:color w:val="92400E"/>
+                <w:sz w:val="18"/>
+              </w:rPr>
+              <w:t>Planned</w:t>
+            </w:r>
+          </w:p>
+        </w:tc>
+      </w:tr>
+      <w:tr>
+        <w:tc>
+          <w:tcPr>
+            <w:tcW w:type="dxa" w:w="3135"/>
+            <w:shd w:val="clear" w:color="auto" w:fill="f0f4fa"/>
+          </w:tcPr>
+          <w:p>
+            <w:r>
+              <w:rPr>
+                <w:b/>
+                <w:sz w:val="18"/>
+              </w:rPr>
+              <w:t>Performance Tracking (KPIs)</w:t>
+            </w:r>
+          </w:p>
+        </w:tc>
+        <w:tc>
+          <w:tcPr>
+            <w:tcW w:type="dxa" w:w="3135"/>
+            <w:shd w:val="clear" w:color="auto" w:fill="f0f4fa"/>
+          </w:tcPr>
+          <w:p>
+            <w:r>
+              <w:rPr>
+                <w:sz w:val="17"/>
+              </w:rPr>
+              <w:t>Inventory accuracy, picker efficiency &amp; picking accuracy, Order cycle time, on-time shipment rate, order fulfillment rate, Space utilization, stock aging, near-expiry stock alerts...</w:t>
+            </w:r>
+          </w:p>
+        </w:tc>
+        <w:tc>
+          <w:tcPr>
+            <w:tcW w:type="dxa" w:w="3135"/>
+            <w:shd w:val="clear" w:color="auto" w:fill="f0f4fa"/>
+          </w:tcPr>
+          <w:p>
+            <w:r>
+              <w:rPr>
+                <w:color w:val="92400E"/>
+                <w:sz w:val="18"/>
+              </w:rPr>
+              <w:t>Planned</w:t>
+            </w:r>
+          </w:p>
+        </w:tc>
+      </w:tr>
+      <w:tr>
+        <w:tc>
+          <w:tcPr>
+            <w:tcW w:type="dxa" w:w="3135"/>
+            <w:shd w:val="clear" w:color="auto" w:fill="ffffff"/>
+          </w:tcPr>
+          <w:p>
+            <w:r>
+              <w:rPr>
+                <w:b/>
+                <w:sz w:val="18"/>
+              </w:rPr>
+              <w:t>Dashboard &amp; Reporting (Enhancements)</w:t>
+            </w:r>
+          </w:p>
+        </w:tc>
+        <w:tc>
+          <w:tcPr>
+            <w:tcW w:type="dxa" w:w="3135"/>
+            <w:shd w:val="clear" w:color="auto" w:fill="ffffff"/>
+          </w:tcPr>
+          <w:p>
+            <w:r>
+              <w:rPr>
+                <w:sz w:val="17"/>
+              </w:rPr>
+              <w:t>Customizable dashboards &amp; role-based views, Alerts &amp; notifications when KPIs breach thresholds, Scheduled automatic report generation &amp; email delivery...</w:t>
+            </w:r>
+          </w:p>
+        </w:tc>
+        <w:tc>
+          <w:tcPr>
+            <w:tcW w:type="dxa" w:w="3135"/>
+            <w:shd w:val="clear" w:color="auto" w:fill="ffffff"/>
+          </w:tcPr>
+          <w:p>
+            <w:r>
+              <w:rPr>
+                <w:color w:val="92400E"/>
+                <w:sz w:val="18"/>
+              </w:rPr>
+              <w:t>Planned</w:t>
+            </w:r>
+          </w:p>
+        </w:tc>
+      </w:tr>
+      <w:tr>
+        <w:tc>
+          <w:tcPr>
+            <w:tcW w:type="dxa" w:w="3135"/>
+            <w:shd w:val="clear" w:color="auto" w:fill="f0f4fa"/>
+          </w:tcPr>
+          <w:p>
+            <w:r>
+              <w:rPr>
+                <w:b/>
+                <w:sz w:val="18"/>
+              </w:rPr>
+              <w:t>Labour Management</w:t>
+            </w:r>
+          </w:p>
+        </w:tc>
+        <w:tc>
+          <w:tcPr>
+            <w:tcW w:type="dxa" w:w="3135"/>
+            <w:shd w:val="clear" w:color="auto" w:fill="f0f4fa"/>
+          </w:tcPr>
+          <w:p>
+            <w:r>
+              <w:rPr>
+                <w:sz w:val="17"/>
+              </w:rPr>
+              <w:t>Track individual and team performance, Plan and assign tasks to warehouse staff, Measure active vs. idle time; identify training needs...</w:t>
+            </w:r>
+          </w:p>
+        </w:tc>
+        <w:tc>
+          <w:tcPr>
+            <w:tcW w:type="dxa" w:w="3135"/>
+            <w:shd w:val="clear" w:color="auto" w:fill="f0f4fa"/>
+          </w:tcPr>
+          <w:p>
+            <w:r>
+              <w:rPr>
+                <w:color w:val="92400E"/>
+                <w:sz w:val="18"/>
+              </w:rPr>
+              <w:t>Planned</w:t>
+            </w:r>
+          </w:p>
+        </w:tc>
+      </w:tr>
+      <w:tr>
+        <w:tc>
+          <w:tcPr>
+            <w:tcW w:type="dxa" w:w="3135"/>
+            <w:shd w:val="clear" w:color="auto" w:fill="ffffff"/>
+          </w:tcPr>
+          <w:p>
+            <w:r>
+              <w:rPr>
+                <w:b/>
+                <w:sz w:val="18"/>
+              </w:rPr>
+              <w:t>Transport Management</w:t>
+            </w:r>
+          </w:p>
+        </w:tc>
+        <w:tc>
+          <w:tcPr>
+            <w:tcW w:type="dxa" w:w="3135"/>
+            <w:shd w:val="clear" w:color="auto" w:fill="ffffff"/>
+          </w:tcPr>
+          <w:p>
+            <w:r>
+              <w:rPr>
+                <w:sz w:val="17"/>
+              </w:rPr>
+              <w:t>Plan &amp; optimize delivery routes automatically, Track transport costs: fuel, maintenance, tyres, tolls, Assign vehicles to routes by capacity &amp; availability...</w:t>
+            </w:r>
+          </w:p>
+        </w:tc>
+        <w:tc>
+          <w:tcPr>
+            <w:tcW w:type="dxa" w:w="3135"/>
+            <w:shd w:val="clear" w:color="auto" w:fill="ffffff"/>
+          </w:tcPr>
+          <w:p>
+            <w:r>
+              <w:rPr>
+                <w:color w:val="92400E"/>
+                <w:sz w:val="18"/>
+              </w:rPr>
+              <w:t>Planned</w:t>
+            </w:r>
+          </w:p>
+        </w:tc>
+      </w:tr>
+      <w:tr>
+        <w:tc>
+          <w:tcPr>
+            <w:tcW w:type="dxa" w:w="3135"/>
+            <w:shd w:val="clear" w:color="auto" w:fill="f0f4fa"/>
+          </w:tcPr>
+          <w:p>
+            <w:r>
+              <w:rPr>
+                <w:b/>
+                <w:sz w:val="18"/>
+              </w:rPr>
+              <w:t>Mobile Devices &amp; Scanning</w:t>
+            </w:r>
+          </w:p>
+        </w:tc>
+        <w:tc>
+          <w:tcPr>
+            <w:tcW w:type="dxa" w:w="3135"/>
+            <w:shd w:val="clear" w:color="auto" w:fill="f0f4fa"/>
+          </w:tcPr>
+          <w:p>
+            <w:r>
+              <w:rPr>
+                <w:sz w:val="17"/>
+              </w:rPr>
+              <w:t>Mobile app for warehouse staff (tablets &amp; handheld scanners), Barcode and QR code scanning enhancements, Offline mode with sync when back online...</w:t>
+            </w:r>
+          </w:p>
+        </w:tc>
+        <w:tc>
+          <w:tcPr>
+            <w:tcW w:type="dxa" w:w="3135"/>
+            <w:shd w:val="clear" w:color="auto" w:fill="f0f4fa"/>
+          </w:tcPr>
+          <w:p>
+            <w:r>
+              <w:rPr>
+                <w:color w:val="92400E"/>
+                <w:sz w:val="18"/>
+              </w:rPr>
+              <w:t>Planned</w:t>
+            </w:r>
+          </w:p>
+        </w:tc>
+      </w:tr>
+      <w:tr>
+        <w:tc>
+          <w:tcPr>
+            <w:tcW w:type="dxa" w:w="3135"/>
+            <w:shd w:val="clear" w:color="auto" w:fill="ffffff"/>
+          </w:tcPr>
+          <w:p>
+            <w:r>
+              <w:rPr>
+                <w:b/>
+                <w:sz w:val="18"/>
+              </w:rPr>
+              <w:t>User Access &amp; Security</w:t>
+            </w:r>
+          </w:p>
+        </w:tc>
+        <w:tc>
+          <w:tcPr>
+            <w:tcW w:type="dxa" w:w="3135"/>
+            <w:shd w:val="clear" w:color="auto" w:fill="ffffff"/>
+          </w:tcPr>
+          <w:p>
+            <w:r>
+              <w:rPr>
+                <w:sz w:val="17"/>
+              </w:rPr>
+              <w:t>Full audit trail — track every system change, Approval workflows for sensitive actions (stock adjustments, write-offs), Two-factor authentication for managers...</w:t>
+            </w:r>
+          </w:p>
+        </w:tc>
+        <w:tc>
+          <w:tcPr>
+            <w:tcW w:type="dxa" w:w="3135"/>
+            <w:shd w:val="clear" w:color="auto" w:fill="ffffff"/>
+          </w:tcPr>
+          <w:p>
+            <w:r>
+              <w:rPr>
+                <w:color w:val="92400E"/>
+                <w:sz w:val="18"/>
+              </w:rPr>
+              <w:t>Planned</w:t>
+            </w:r>
+          </w:p>
+        </w:tc>
+      </w:tr>
+      <w:tr>
+        <w:tc>
+          <w:tcPr>
+            <w:tcW w:type="dxa" w:w="3135"/>
+            <w:shd w:val="clear" w:color="auto" w:fill="f0f4fa"/>
+          </w:tcPr>
+          <w:p>
+            <w:r>
+              <w:rPr>
+                <w:b/>
+                <w:sz w:val="18"/>
+              </w:rPr>
+              <w:t>Integration with Grays Shops</w:t>
+            </w:r>
+          </w:p>
+        </w:tc>
+        <w:tc>
+          <w:tcPr>
+            <w:tcW w:type="dxa" w:w="3135"/>
+            <w:shd w:val="clear" w:color="auto" w:fill="f0f4fa"/>
+          </w:tcPr>
+          <w:p>
+            <w:r>
+              <w:rPr>
+                <w:sz w:val="17"/>
+              </w:rPr>
+              <w:t>Product availability &amp; shortage alerts by ABC classification, Automated requisition link to referencing sent to DP...</w:t>
+            </w:r>
+          </w:p>
+        </w:tc>
+        <w:tc>
+          <w:tcPr>
+            <w:tcW w:type="dxa" w:w="3135"/>
+            <w:shd w:val="clear" w:color="auto" w:fill="f0f4fa"/>
+          </w:tcPr>
+          <w:p>
+            <w:r>
+              <w:rPr>
+                <w:color w:val="92400E"/>
+                <w:sz w:val="18"/>
+              </w:rPr>
+              <w:t>Planned</w:t>
+            </w:r>
+          </w:p>
+        </w:tc>
+      </w:tr>
+      <w:tr>
+        <w:tc>
+          <w:tcPr>
+            <w:tcW w:type="dxa" w:w="3135"/>
+            <w:shd w:val="clear" w:color="auto" w:fill="ffffff"/>
+          </w:tcPr>
+          <w:p>
+            <w:r>
+              <w:rPr>
+                <w:b/>
+                <w:sz w:val="18"/>
+              </w:rPr>
+              <w:t>Implementation &amp; Support</w:t>
+            </w:r>
+          </w:p>
+        </w:tc>
+        <w:tc>
+          <w:tcPr>
+            <w:tcW w:type="dxa" w:w="3135"/>
+            <w:shd w:val="clear" w:color="auto" w:fill="ffffff"/>
+          </w:tcPr>
+          <w:p>
+            <w:r>
+              <w:rPr>
+                <w:sz w:val="17"/>
+              </w:rPr>
+              <w:t>Phased implementation starting with one warehouse, Training for all roles; user manuals &amp; video tutorials (English &amp; French), Ongoing support: critical issues &lt;2hrs, normal &lt;24hrs...</w:t>
+            </w:r>
+          </w:p>
+        </w:tc>
+        <w:tc>
+          <w:tcPr>
+            <w:tcW w:type="dxa" w:w="3135"/>
+            <w:shd w:val="clear" w:color="auto" w:fill="ffffff"/>
+          </w:tcPr>
+          <w:p>
+            <w:r>
+              <w:rPr>
+                <w:color w:val="92400E"/>
+                <w:sz w:val="18"/>
+              </w:rPr>
+              <w:t>Planned</w:t>
             </w:r>
           </w:p>
         </w:tc>
       </w:tr>
     </w:tbl>
     <w:p>
+      <w:r>
+        <w:br w:type="page"/>
+      </w:r>
+    </w:p>
+    <w:p>
       <w:pPr>
-        <w:spacing w:before="360" w:after="120"/>
+        <w:spacing w:before="320" w:after="120"/>
       </w:pPr>
       <w:r>
         <w:rPr>
           <w:b/>
           <w:color w:val="1E3A5F"/>
-          <w:sz w:val="36"/>
+          <w:sz w:val="34"/>
         </w:rPr>
-        <w:t>4. Delivery Approach</w:t>
+        <w:t>4. Project Plan &amp; Timeline</w:t>
       </w:r>
     </w:p>
     <w:p>
@@ -1027,10 +1745,22 @@
       <w:r>
         <w:rPr>
           <w:b w:val="0"/>
-          <w:i w:val="0"/>
           <w:sz w:val="21"/>
         </w:rPr>
-        <w:t>The engagement follows an agile, module-by-module delivery model. Each module goes through four stages: Design → Build → Test → Release. Modules are deployed to production as soon as they pass user acceptance testing — there is no need to wait for the full six-month timeline.</w:t>
+        <w:t>Modules are delivered incrementally — released to production as soon as they pass UAT. The two on-site months (Months 3–4) cover go-live support and user training for all warehouses.</w:t>
+      </w:r>
+    </w:p>
+    <w:p>
+      <w:pPr>
+        <w:spacing w:before="200" w:after="80"/>
+      </w:pPr>
+      <w:r>
+        <w:rPr>
+          <w:b/>
+          <w:color w:val="2B6CB0"/>
+          <w:sz w:val="26"/>
+        </w:rPr>
+        <w:t>Phase 1 Completion + Warehouse Structure  (Month 1)</w:t>
       </w:r>
     </w:p>
     <w:p>
@@ -1043,7 +1773,7 @@
         <w:rPr>
           <w:sz w:val="21"/>
         </w:rPr>
-        <w:t>Each module delivered as a versioned desktop application update.</w:t>
+        <w:t>Complete Phase 1 remaining items: Advanced Reporting, Dashboard Builder, Customer Notifications</w:t>
       </w:r>
     </w:p>
     <w:p>
@@ -1056,7 +1786,7 @@
         <w:rPr>
           <w:sz w:val="21"/>
         </w:rPr>
-        <w:t>Hotfixes and minor enhancements included within the monthly rate.</w:t>
+        <w:t>Warehouse Structure &amp; Locations module</w:t>
       </w:r>
     </w:p>
     <w:p>
@@ -1069,7 +1799,7 @@
         <w:rPr>
           <w:sz w:val="21"/>
         </w:rPr>
-        <w:t>Weekly status call and written progress report.</w:t>
+        <w:t>AI Readiness framework</w:t>
       </w:r>
     </w:p>
     <w:p>
@@ -1082,7 +1812,20 @@
         <w:rPr>
           <w:sz w:val="21"/>
         </w:rPr>
-        <w:t>All source code committed to the private GitHub repository with release tags.</w:t>
+        <w:t>Auto-updater and release pipeline</w:t>
+      </w:r>
+    </w:p>
+    <w:p>
+      <w:pPr>
+        <w:spacing w:before="200" w:after="80"/>
+      </w:pPr>
+      <w:r>
+        <w:rPr>
+          <w:b/>
+          <w:color w:val="2B6CB0"/>
+          <w:sz w:val="26"/>
+        </w:rPr>
+        <w:t>Receiving + QC + Put-Away  (Month 2)</w:t>
       </w:r>
     </w:p>
     <w:p>
@@ -1095,33 +1838,7 @@
         <w:rPr>
           <w:sz w:val="21"/>
         </w:rPr>
-        <w:t>On-site presence for two months during the peak go-live period (Months 3 &amp; 4).</w:t>
-      </w:r>
-    </w:p>
-    <w:p>
-      <w:pPr>
-        <w:spacing w:before="360" w:after="120"/>
-      </w:pPr>
-      <w:r>
-        <w:rPr>
-          <w:b/>
-          <w:color w:val="1E3A5F"/>
-          <w:sz w:val="36"/>
-        </w:rPr>
-        <w:t>5. Project Plan &amp; Timeline</w:t>
-      </w:r>
-    </w:p>
-    <w:p>
-      <w:pPr>
-        <w:spacing w:before="240" w:after="120"/>
-      </w:pPr>
-      <w:r>
-        <w:rPr>
-          <w:b/>
-          <w:color w:val="2B6CB0"/>
-          <w:sz w:val="28"/>
-        </w:rPr>
-        <w:t>Phase 1 — Foundation &amp; GL/AP  (Month 1–2)</w:t>
+        <w:t>Receiving Goods module (barcode scanning, ASN, GRN printing)</w:t>
       </w:r>
     </w:p>
     <w:p>
@@ -1134,7 +1851,7 @@
         <w:rPr>
           <w:sz w:val="21"/>
         </w:rPr>
-        <w:t>Requirements workshops and system audit</w:t>
+        <w:t>Quality Control module (checklists, Non-Conform flagging)</w:t>
       </w:r>
     </w:p>
     <w:p>
@@ -1147,7 +1864,7 @@
         <w:rPr>
           <w:sz w:val="21"/>
         </w:rPr>
-        <w:t>GL module: journal review, trial balance, period close</w:t>
+        <w:t>Put-Away module (FEFO/ABC strategies, mobile-guided)</w:t>
       </w:r>
     </w:p>
     <w:p>
@@ -1160,7 +1877,20 @@
         <w:rPr>
           <w:sz w:val="21"/>
         </w:rPr>
-        <w:t>AP module: invoice capture, approval workflow, payment scheduling</w:t>
+        <w:t>Inventory Management enhancements (replenishment triggers)</w:t>
+      </w:r>
+    </w:p>
+    <w:p>
+      <w:pPr>
+        <w:spacing w:before="200" w:after="80"/>
+      </w:pPr>
+      <w:r>
+        <w:rPr>
+          <w:b/>
+          <w:color w:val="2B6CB0"/>
+          <w:sz w:val="26"/>
+        </w:rPr>
+        <w:t>Stock Reservation + Order Management + Picking (ON-SITE begins)  (Month 3)</w:t>
       </w:r>
     </w:p>
     <w:p>
@@ -1173,7 +1903,7 @@
         <w:rPr>
           <w:sz w:val="21"/>
         </w:rPr>
-        <w:t>Auto-updater deployment pipeline</w:t>
+        <w:t>Stock Reservation module</w:t>
       </w:r>
     </w:p>
     <w:p>
@@ -1186,20 +1916,7 @@
         <w:rPr>
           <w:sz w:val="21"/>
         </w:rPr>
-        <w:t>On-site kick-off week (1 week)</w:t>
-      </w:r>
-    </w:p>
-    <w:p>
-      <w:pPr>
-        <w:spacing w:before="240" w:after="120"/>
-      </w:pPr>
-      <w:r>
-        <w:rPr>
-          <w:b/>
-          <w:color w:val="2B6CB0"/>
-          <w:sz w:val="28"/>
-        </w:rPr>
-        <w:t>Phase 2 — AR / FA / OM  (Month 2–3)</w:t>
+        <w:t>Order Management enhancements (EDI, pallet splitting)</w:t>
       </w:r>
     </w:p>
     <w:p>
@@ -1212,7 +1929,7 @@
         <w:rPr>
           <w:sz w:val="21"/>
         </w:rPr>
-        <w:t>AR module: customer invoicing, receipt matching, aging</w:t>
+        <w:t>Picking enhancements (wave/batch picking, route optimization)</w:t>
       </w:r>
     </w:p>
     <w:p>
@@ -1225,7 +1942,20 @@
         <w:rPr>
           <w:sz w:val="21"/>
         </w:rPr>
-        <w:t>FA module: asset register, depreciation, additions/disposals</w:t>
+        <w:t>ON-SITE: go-live support for Months 1–2 modules, user training</w:t>
+      </w:r>
+    </w:p>
+    <w:p>
+      <w:pPr>
+        <w:spacing w:before="200" w:after="80"/>
+      </w:pPr>
+      <w:r>
+        <w:rPr>
+          <w:b/>
+          <w:color w:val="2B6CB0"/>
+          <w:sz w:val="26"/>
+        </w:rPr>
+        <w:t>Loading + Shipping + Returns + KPIs (ON-SITE)  (Month 4)</w:t>
       </w:r>
     </w:p>
     <w:p>
@@ -1238,7 +1968,7 @@
         <w:rPr>
           <w:sz w:val="21"/>
         </w:rPr>
-        <w:t>OM module: sales order lifecycle, shipping confirmation</w:t>
+        <w:t>Loading &amp; Dispatch enhancements (manifests, capacity checks)</w:t>
       </w:r>
     </w:p>
     <w:p>
@@ -1251,20 +1981,7 @@
         <w:rPr>
           <w:sz w:val="21"/>
         </w:rPr>
-        <w:t>Reporting dashboard v1</w:t>
-      </w:r>
-    </w:p>
-    <w:p>
-      <w:pPr>
-        <w:spacing w:before="240" w:after="120"/>
-      </w:pPr>
-      <w:r>
-        <w:rPr>
-          <w:b/>
-          <w:color w:val="2B6CB0"/>
-          <w:sz w:val="28"/>
-        </w:rPr>
-        <w:t>Phase 3 — Cash / POS / Sync (On-Site)  (Month 3–4)</w:t>
+        <w:t>Shipping enhancements (POD with signatures/photos)</w:t>
       </w:r>
     </w:p>
     <w:p>
@@ -1277,7 +1994,7 @@
         <w:rPr>
           <w:sz w:val="21"/>
         </w:rPr>
-        <w:t>Cash &amp; Bank reconciliation module</w:t>
+        <w:t>Returns &amp; Reverse Logistics module</w:t>
       </w:r>
     </w:p>
     <w:p>
@@ -1290,7 +2007,7 @@
         <w:rPr>
           <w:sz w:val="21"/>
         </w:rPr>
-        <w:t>POS module: barcode scanning, cash drawer integration</w:t>
+        <w:t>Performance Tracking (KPIs) module</w:t>
       </w:r>
     </w:p>
     <w:p>
@@ -1303,7 +2020,20 @@
         <w:rPr>
           <w:sz w:val="21"/>
         </w:rPr>
-        <w:t>Data synchronisation engine (Fusion ↔ WMS)</w:t>
+        <w:t>ON-SITE: continued training, hypercare support</w:t>
+      </w:r>
+    </w:p>
+    <w:p>
+      <w:pPr>
+        <w:spacing w:before="200" w:after="80"/>
+      </w:pPr>
+      <w:r>
+        <w:rPr>
+          <w:b/>
+          <w:color w:val="2B6CB0"/>
+          <w:sz w:val="26"/>
+        </w:rPr>
+        <w:t>Dashboard + Labour + Transport + Mobile  (Month 5)</w:t>
       </w:r>
     </w:p>
     <w:p>
@@ -1316,7 +2046,7 @@
         <w:rPr>
           <w:sz w:val="21"/>
         </w:rPr>
-        <w:t>Full on-site go-live support (Month 3–4, 2 months)</w:t>
+        <w:t>Dashboard &amp; Reporting enhancements (scheduled reports, alerts)</w:t>
       </w:r>
     </w:p>
     <w:p>
@@ -1329,20 +2059,7 @@
         <w:rPr>
           <w:sz w:val="21"/>
         </w:rPr>
-        <w:t>User training sessions for all modules</w:t>
-      </w:r>
-    </w:p>
-    <w:p>
-      <w:pPr>
-        <w:spacing w:before="240" w:after="120"/>
-      </w:pPr>
-      <w:r>
-        <w:rPr>
-          <w:b/>
-          <w:color w:val="2B6CB0"/>
-          <w:sz w:val="28"/>
-        </w:rPr>
-        <w:t>Phase 4 — Reporting, Mobile &amp; Hardening  (Month 4–5)</w:t>
+        <w:t>Labour Management module</w:t>
       </w:r>
     </w:p>
     <w:p>
@@ -1355,7 +2072,7 @@
         <w:rPr>
           <w:sz w:val="21"/>
         </w:rPr>
-        <w:t>Cross-module analytics and KPI dashboards</w:t>
+        <w:t>Transport Management module (route optimization, GPS integration)</w:t>
       </w:r>
     </w:p>
     <w:p>
@@ -1368,7 +2085,20 @@
         <w:rPr>
           <w:sz w:val="21"/>
         </w:rPr>
-        <w:t>Mobile PWA for warehouse staff</w:t>
+        <w:t>Mobile Devices &amp; Scanning enhancements (offline mode)</w:t>
+      </w:r>
+    </w:p>
+    <w:p>
+      <w:pPr>
+        <w:spacing w:before="200" w:after="80"/>
+      </w:pPr>
+      <w:r>
+        <w:rPr>
+          <w:b/>
+          <w:color w:val="2B6CB0"/>
+          <w:sz w:val="26"/>
+        </w:rPr>
+        <w:t>Security + Integration + Stabilisation  (Month 6)</w:t>
       </w:r>
     </w:p>
     <w:p>
@@ -1381,7 +2111,7 @@
         <w:rPr>
           <w:sz w:val="21"/>
         </w:rPr>
-        <w:t>Performance tuning and security review</w:t>
+        <w:t>User Access &amp; Security (audit trail, 2FA, approval workflows)</w:t>
       </w:r>
     </w:p>
     <w:p>
@@ -1394,20 +2124,20 @@
         <w:rPr>
           <w:sz w:val="21"/>
         </w:rPr>
-        <w:t>User feedback loop and iterative improvements</w:t>
+        <w:t>System Integration enhancements (EDI, e-commerce)</w:t>
       </w:r>
     </w:p>
     <w:p>
       <w:pPr>
-        <w:spacing w:before="240" w:after="120"/>
+        <w:pStyle w:val="ListBullet"/>
+        <w:spacing w:after="60"/>
+        <w:ind w:left="432"/>
       </w:pPr>
       <w:r>
         <w:rPr>
-          <w:b/>
-          <w:color w:val="2B6CB0"/>
-          <w:sz w:val="28"/>
+          <w:sz w:val="21"/>
         </w:rPr>
-        <w:t>Phase 5 — Stabilisation &amp; Handover  (Month 5–6)</w:t>
+        <w:t>Integration with Grays Shops (shortage alerts, requisitions)</w:t>
       </w:r>
     </w:p>
     <w:p>
@@ -1433,20 +2163,7 @@
         <w:rPr>
           <w:sz w:val="21"/>
         </w:rPr>
-        <w:t>Documentation and user manuals</w:t>
-      </w:r>
-    </w:p>
-    <w:p>
-      <w:pPr>
-        <w:pStyle w:val="ListBullet"/>
-        <w:spacing w:after="60"/>
-        <w:ind w:left="432"/>
-      </w:pPr>
-      <w:r>
-        <w:rPr>
-          <w:sz w:val="21"/>
-        </w:rPr>
-        <w:t>Knowledge transfer sessions</w:t>
+        <w:t>Documentation, user manuals (English &amp; French), knowledge transfer</w:t>
       </w:r>
     </w:p>
     <w:p>
@@ -1464,28 +2181,15 @@
     </w:p>
     <w:p>
       <w:pPr>
-        <w:pStyle w:val="ListBullet"/>
-        <w:spacing w:after="60"/>
-        <w:ind w:left="432"/>
-      </w:pPr>
-      <w:r>
-        <w:rPr>
-          <w:sz w:val="21"/>
-        </w:rPr>
-        <w:t>Post-go-live hypercare support</w:t>
-      </w:r>
-    </w:p>
-    <w:p>
-      <w:pPr>
-        <w:spacing w:before="280" w:after="120"/>
+        <w:spacing w:before="200" w:after="80"/>
       </w:pPr>
       <w:r>
         <w:rPr>
           <w:b/>
-          <w:color w:val="1E3A5F"/>
-          <w:sz w:val="28"/>
+          <w:color w:val="2B6CB0"/>
+          <w:sz w:val="26"/>
         </w:rPr>
-        <w:t>High-Level Gantt</w:t>
+        <w:t>High-Level Gantt Summary</w:t>
       </w:r>
     </w:p>
     <w:tbl>
@@ -1514,7 +2218,7 @@
               <w:rPr>
                 <w:b/>
                 <w:color w:val="FFFFFF"/>
-                <w:sz w:val="18"/>
+                <w:sz w:val="16"/>
               </w:rPr>
               <w:t>Module / Phase</w:t>
             </w:r>
@@ -1644,9 +2348,9 @@
           <w:p>
             <w:r>
               <w:rPr>
-                <w:sz w:val="18"/>
+                <w:sz w:val="17"/>
               </w:rPr>
-              <w:t>GL / AP</w:t>
+              <w:t>Phase 1 Completion + Warehouse</w:t>
             </w:r>
           </w:p>
         </w:tc>
@@ -1667,6 +2371,64 @@
               <w:t>●</w:t>
             </w:r>
           </w:p>
+        </w:tc>
+        <w:tc>
+          <w:tcPr>
+            <w:tcW w:type="dxa" w:w="1344"/>
+            <w:shd w:val="clear" w:color="auto" w:fill="ffffff"/>
+          </w:tcPr>
+          <w:p/>
+        </w:tc>
+        <w:tc>
+          <w:tcPr>
+            <w:tcW w:type="dxa" w:w="1344"/>
+            <w:shd w:val="clear" w:color="auto" w:fill="ffffff"/>
+          </w:tcPr>
+          <w:p/>
+        </w:tc>
+        <w:tc>
+          <w:tcPr>
+            <w:tcW w:type="dxa" w:w="1344"/>
+            <w:shd w:val="clear" w:color="auto" w:fill="ffffff"/>
+          </w:tcPr>
+          <w:p/>
+        </w:tc>
+        <w:tc>
+          <w:tcPr>
+            <w:tcW w:type="dxa" w:w="1344"/>
+            <w:shd w:val="clear" w:color="auto" w:fill="ffffff"/>
+          </w:tcPr>
+          <w:p/>
+        </w:tc>
+        <w:tc>
+          <w:tcPr>
+            <w:tcW w:type="dxa" w:w="1344"/>
+            <w:shd w:val="clear" w:color="auto" w:fill="ffffff"/>
+          </w:tcPr>
+          <w:p/>
+        </w:tc>
+      </w:tr>
+      <w:tr>
+        <w:tc>
+          <w:tcPr>
+            <w:tcW w:type="dxa" w:w="1344"/>
+            <w:shd w:val="clear" w:color="auto" w:fill="f8fafc"/>
+          </w:tcPr>
+          <w:p>
+            <w:r>
+              <w:rPr>
+                <w:sz w:val="17"/>
+              </w:rPr>
+              <w:t>Receiving / QC / Put-Away</w:t>
+            </w:r>
+          </w:p>
+        </w:tc>
+        <w:tc>
+          <w:tcPr>
+            <w:tcW w:type="dxa" w:w="1344"/>
+            <w:shd w:val="clear" w:color="auto" w:fill="ffffff"/>
+          </w:tcPr>
+          <w:p/>
         </w:tc>
         <w:tc>
           <w:tcPr>
@@ -1724,9 +2486,9 @@
           <w:p>
             <w:r>
               <w:rPr>
-                <w:sz w:val="18"/>
+                <w:sz w:val="17"/>
               </w:rPr>
-              <w:t>AR / FA / OM</w:t>
+              <w:t>Stock Res / OM / Picking</w:t>
             </w:r>
           </w:p>
         </w:tc>
@@ -1740,20 +2502,9 @@
         <w:tc>
           <w:tcPr>
             <w:tcW w:type="dxa" w:w="1344"/>
-            <w:shd w:val="clear" w:color="auto" w:fill="2b6cb0"/>
+            <w:shd w:val="clear" w:color="auto" w:fill="ffffff"/>
           </w:tcPr>
-          <w:p>
-            <w:pPr>
-              <w:jc w:val="center"/>
-            </w:pPr>
-            <w:r>
-              <w:rPr>
-                <w:color w:val="FFFFFF"/>
-                <w:sz w:val="18"/>
-              </w:rPr>
-              <w:t>●</w:t>
-            </w:r>
-          </w:p>
+          <w:p/>
         </w:tc>
         <w:tc>
           <w:tcPr>
@@ -1804,89 +2555,9 @@
           <w:p>
             <w:r>
               <w:rPr>
-                <w:sz w:val="18"/>
+                <w:sz w:val="17"/>
               </w:rPr>
-              <w:t>Cash / POS / Sync</w:t>
-            </w:r>
-          </w:p>
-        </w:tc>
-        <w:tc>
-          <w:tcPr>
-            <w:tcW w:type="dxa" w:w="1344"/>
-            <w:shd w:val="clear" w:color="auto" w:fill="ffffff"/>
-          </w:tcPr>
-          <w:p/>
-        </w:tc>
-        <w:tc>
-          <w:tcPr>
-            <w:tcW w:type="dxa" w:w="1344"/>
-            <w:shd w:val="clear" w:color="auto" w:fill="ffffff"/>
-          </w:tcPr>
-          <w:p/>
-        </w:tc>
-        <w:tc>
-          <w:tcPr>
-            <w:tcW w:type="dxa" w:w="1344"/>
-            <w:shd w:val="clear" w:color="auto" w:fill="2b6cb0"/>
-          </w:tcPr>
-          <w:p>
-            <w:pPr>
-              <w:jc w:val="center"/>
-            </w:pPr>
-            <w:r>
-              <w:rPr>
-                <w:color w:val="FFFFFF"/>
-                <w:sz w:val="18"/>
-              </w:rPr>
-              <w:t>●</w:t>
-            </w:r>
-          </w:p>
-        </w:tc>
-        <w:tc>
-          <w:tcPr>
-            <w:tcW w:type="dxa" w:w="1344"/>
-            <w:shd w:val="clear" w:color="auto" w:fill="2b6cb0"/>
-          </w:tcPr>
-          <w:p>
-            <w:pPr>
-              <w:jc w:val="center"/>
-            </w:pPr>
-            <w:r>
-              <w:rPr>
-                <w:color w:val="FFFFFF"/>
-                <w:sz w:val="18"/>
-              </w:rPr>
-              <w:t>●</w:t>
-            </w:r>
-          </w:p>
-        </w:tc>
-        <w:tc>
-          <w:tcPr>
-            <w:tcW w:type="dxa" w:w="1344"/>
-            <w:shd w:val="clear" w:color="auto" w:fill="ffffff"/>
-          </w:tcPr>
-          <w:p/>
-        </w:tc>
-        <w:tc>
-          <w:tcPr>
-            <w:tcW w:type="dxa" w:w="1344"/>
-            <w:shd w:val="clear" w:color="auto" w:fill="ffffff"/>
-          </w:tcPr>
-          <w:p/>
-        </w:tc>
-      </w:tr>
-      <w:tr>
-        <w:tc>
-          <w:tcPr>
-            <w:tcW w:type="dxa" w:w="1344"/>
-            <w:shd w:val="clear" w:color="auto" w:fill="f8fafc"/>
-          </w:tcPr>
-          <w:p>
-            <w:r>
-              <w:rPr>
-                <w:sz w:val="18"/>
-              </w:rPr>
-              <w:t>Reporting / Mobile</w:t>
+              <w:t>Loading / Shipping / Returns / KPIs</w:t>
             </w:r>
           </w:p>
         </w:tc>
@@ -1932,20 +2603,9 @@
         <w:tc>
           <w:tcPr>
             <w:tcW w:type="dxa" w:w="1344"/>
-            <w:shd w:val="clear" w:color="auto" w:fill="2b6cb0"/>
+            <w:shd w:val="clear" w:color="auto" w:fill="ffffff"/>
           </w:tcPr>
-          <w:p>
-            <w:pPr>
-              <w:jc w:val="center"/>
-            </w:pPr>
-            <w:r>
-              <w:rPr>
-                <w:color w:val="FFFFFF"/>
-                <w:sz w:val="18"/>
-              </w:rPr>
-              <w:t>●</w:t>
-            </w:r>
-          </w:p>
+          <w:p/>
         </w:tc>
         <w:tc>
           <w:tcPr>
@@ -1964,9 +2624,9 @@
           <w:p>
             <w:r>
               <w:rPr>
-                <w:sz w:val="18"/>
+                <w:sz w:val="17"/>
               </w:rPr>
-              <w:t>Stabilisation / Handover</w:t>
+              <w:t>Dashboard / Labour / Transport / Mobile</w:t>
             </w:r>
           </w:p>
         </w:tc>
@@ -2019,6 +2679,64 @@
         <w:tc>
           <w:tcPr>
             <w:tcW w:type="dxa" w:w="1344"/>
+            <w:shd w:val="clear" w:color="auto" w:fill="ffffff"/>
+          </w:tcPr>
+          <w:p/>
+        </w:tc>
+      </w:tr>
+      <w:tr>
+        <w:tc>
+          <w:tcPr>
+            <w:tcW w:type="dxa" w:w="1344"/>
+            <w:shd w:val="clear" w:color="auto" w:fill="f8fafc"/>
+          </w:tcPr>
+          <w:p>
+            <w:r>
+              <w:rPr>
+                <w:sz w:val="17"/>
+              </w:rPr>
+              <w:t>Security / Integration / Stabilisation</w:t>
+            </w:r>
+          </w:p>
+        </w:tc>
+        <w:tc>
+          <w:tcPr>
+            <w:tcW w:type="dxa" w:w="1344"/>
+            <w:shd w:val="clear" w:color="auto" w:fill="ffffff"/>
+          </w:tcPr>
+          <w:p/>
+        </w:tc>
+        <w:tc>
+          <w:tcPr>
+            <w:tcW w:type="dxa" w:w="1344"/>
+            <w:shd w:val="clear" w:color="auto" w:fill="ffffff"/>
+          </w:tcPr>
+          <w:p/>
+        </w:tc>
+        <w:tc>
+          <w:tcPr>
+            <w:tcW w:type="dxa" w:w="1344"/>
+            <w:shd w:val="clear" w:color="auto" w:fill="ffffff"/>
+          </w:tcPr>
+          <w:p/>
+        </w:tc>
+        <w:tc>
+          <w:tcPr>
+            <w:tcW w:type="dxa" w:w="1344"/>
+            <w:shd w:val="clear" w:color="auto" w:fill="ffffff"/>
+          </w:tcPr>
+          <w:p/>
+        </w:tc>
+        <w:tc>
+          <w:tcPr>
+            <w:tcW w:type="dxa" w:w="1344"/>
+            <w:shd w:val="clear" w:color="auto" w:fill="ffffff"/>
+          </w:tcPr>
+          <w:p/>
+        </w:tc>
+        <w:tc>
+          <w:tcPr>
+            <w:tcW w:type="dxa" w:w="1344"/>
             <w:shd w:val="clear" w:color="auto" w:fill="2b6cb0"/>
           </w:tcPr>
           <w:p>
@@ -2044,7 +2762,7 @@
           <w:p>
             <w:r>
               <w:rPr>
-                <w:sz w:val="18"/>
+                <w:sz w:val="17"/>
               </w:rPr>
               <w:t>ON-SITE</w:t>
             </w:r>
@@ -2118,26 +2836,26 @@
     </w:tbl>
     <w:p>
       <w:pPr>
-        <w:spacing w:before="360" w:after="120"/>
+        <w:spacing w:before="320" w:after="120"/>
       </w:pPr>
       <w:r>
         <w:rPr>
           <w:b/>
           <w:color w:val="1E3A5F"/>
-          <w:sz w:val="36"/>
+          <w:sz w:val="34"/>
         </w:rPr>
-        <w:t>6. Commercial Terms</w:t>
+        <w:t>5. Commercial Terms</w:t>
       </w:r>
     </w:p>
     <w:p>
       <w:pPr>
-        <w:spacing w:before="360" w:after="120"/>
+        <w:spacing w:before="200" w:after="80"/>
       </w:pPr>
       <w:r>
         <w:rPr>
           <w:b/>
-          <w:color w:val="1E3A5F"/>
-          <w:sz w:val="28"/>
+          <w:color w:val="2B6CB0"/>
+          <w:sz w:val="26"/>
         </w:rPr>
         <w:t>Rate Card</w:t>
       </w:r>
@@ -2319,7 +3037,7 @@
                 <w:b/>
                 <w:sz w:val="20"/>
               </w:rPr>
-              <w:t>USD 250 / day + travel &amp; accommodation</w:t>
+              <w:t>USD 250 / day + T&amp;A actuals</w:t>
             </w:r>
           </w:p>
         </w:tc>
@@ -2333,7 +3051,7 @@
               <w:rPr>
                 <w:sz w:val="19"/>
               </w:rPr>
-              <w:t>Billed actuals for T&amp;A</w:t>
+              <w:t>Travel &amp; accommodation billed at actuals</w:t>
             </w:r>
           </w:p>
         </w:tc>
@@ -2341,15 +3059,15 @@
     </w:tbl>
     <w:p>
       <w:pPr>
-        <w:spacing w:before="360" w:after="120"/>
+        <w:spacing w:before="200" w:after="80"/>
       </w:pPr>
       <w:r>
         <w:rPr>
           <w:b/>
-          <w:color w:val="1E3A5F"/>
-          <w:sz w:val="28"/>
+          <w:color w:val="2B6CB0"/>
+          <w:sz w:val="26"/>
         </w:rPr>
-        <w:t>Project Investment Summary</w:t>
+        <w:t>Investment Summary</w:t>
       </w:r>
     </w:p>
     <w:tbl>
@@ -2441,7 +3159,7 @@
               <w:rPr>
                 <w:sz w:val="20"/>
               </w:rPr>
-              <w:t>Travel &amp; Accommodation (actual)</w:t>
+              <w:t>Travel &amp; Accommodation (actuals)</w:t>
             </w:r>
           </w:p>
         </w:tc>
@@ -2476,7 +3194,7 @@
                 <w:b/>
                 <w:sz w:val="20"/>
               </w:rPr>
-              <w:t>Sub-Total (excl. T&amp;A)</w:t>
+              <w:t>Sub-Total (excluding T&amp;A)</w:t>
             </w:r>
           </w:p>
         </w:tc>
@@ -2512,7 +3230,7 @@
                 <w:color w:val="FFFFFF"/>
                 <w:sz w:val="20"/>
               </w:rPr>
-              <w:t>Total Project Budget (est.)</w:t>
+              <w:t>TOTAL PROJECT BUDGET</w:t>
             </w:r>
           </w:p>
         </w:tc>
@@ -2539,13 +3257,13 @@
     </w:tbl>
     <w:p>
       <w:pPr>
-        <w:spacing w:before="360" w:after="120"/>
+        <w:spacing w:before="200" w:after="80"/>
       </w:pPr>
       <w:r>
         <w:rPr>
           <w:b/>
-          <w:color w:val="1E3A5F"/>
-          <w:sz w:val="28"/>
+          <w:color w:val="2B6CB0"/>
+          <w:sz w:val="26"/>
         </w:rPr>
         <w:t>Payment Terms</w:t>
       </w:r>
@@ -2560,7 +3278,7 @@
         <w:rPr>
           <w:sz w:val="21"/>
         </w:rPr>
-        <w:t>Monthly invoicing — invoice raised on the 1st of each month.</w:t>
+        <w:t>Monthly invoicing — invoice raised on 1st of each month.</w:t>
       </w:r>
     </w:p>
     <w:p>
@@ -2599,31 +3317,31 @@
         <w:rPr>
           <w:sz w:val="21"/>
         </w:rPr>
-        <w:t>Scope changes beyond agreed modules to be quoted separately.</w:t>
+        <w:t>Scope changes beyond agreed modules quoted separately.</w:t>
       </w:r>
     </w:p>
     <w:p>
       <w:pPr>
-        <w:spacing w:before="360" w:after="120"/>
+        <w:spacing w:before="320" w:after="120"/>
       </w:pPr>
       <w:r>
         <w:rPr>
           <w:b/>
           <w:color w:val="1E3A5F"/>
-          <w:sz w:val="36"/>
+          <w:sz w:val="34"/>
         </w:rPr>
-        <w:t>7. Assumptions &amp; Exclusions</w:t>
+        <w:t>6. Assumptions &amp; Exclusions</w:t>
       </w:r>
     </w:p>
     <w:p>
       <w:pPr>
-        <w:spacing w:before="360" w:after="120"/>
+        <w:spacing w:before="200" w:after="80"/>
       </w:pPr>
       <w:r>
         <w:rPr>
           <w:b/>
-          <w:color w:val="1E3A5F"/>
-          <w:sz w:val="28"/>
+          <w:color w:val="2B6CB0"/>
+          <w:sz w:val="26"/>
         </w:rPr>
         <w:t>Assumptions</w:t>
       </w:r>
@@ -2638,7 +3356,7 @@
         <w:rPr>
           <w:sz w:val="21"/>
         </w:rPr>
-        <w:t>Client provides access to Oracle Fusion ERP environment (non-production for development, production for go-live).</w:t>
+        <w:t>Client provides access to Oracle Fusion ERP (non-production for dev, production for go-live).</w:t>
       </w:r>
     </w:p>
     <w:p>
@@ -2651,7 +3369,7 @@
         <w:rPr>
           <w:sz w:val="21"/>
         </w:rPr>
-        <w:t>Oracle APEX REST services and BIP reports are available and configured.</w:t>
+        <w:t>Oracle APEX REST services and BIP reports available and configured.</w:t>
       </w:r>
     </w:p>
     <w:p>
@@ -2677,7 +3395,7 @@
         <w:rPr>
           <w:sz w:val="21"/>
         </w:rPr>
-        <w:t>A dedicated contact is available for requirements clarification within 1 business day.</w:t>
+        <w:t>Dedicated contact available for requirements clarification within 1 business day.</w:t>
       </w:r>
     </w:p>
     <w:p>
@@ -2690,18 +3408,18 @@
         <w:rPr>
           <w:sz w:val="21"/>
         </w:rPr>
-        <w:t>Existing WMS codebase (GitHub: javeedin/graysWMSwebviewnew) continues as the base.</w:t>
+        <w:t>Existing WMS codebase (javeedin/graysWMSwebviewnew) continues as the base.</w:t>
       </w:r>
     </w:p>
     <w:p>
       <w:pPr>
-        <w:spacing w:before="360" w:after="120"/>
+        <w:spacing w:before="200" w:after="80"/>
       </w:pPr>
       <w:r>
         <w:rPr>
           <w:b/>
-          <w:color w:val="1E3A5F"/>
-          <w:sz w:val="28"/>
+          <w:color w:val="2B6CB0"/>
+          <w:sz w:val="26"/>
         </w:rPr>
         <w:t>Exclusions</w:t>
       </w:r>
@@ -2760,15 +3478,15 @@
     </w:p>
     <w:p>
       <w:pPr>
-        <w:spacing w:before="360" w:after="120"/>
+        <w:spacing w:before="320" w:after="120"/>
       </w:pPr>
       <w:r>
         <w:rPr>
           <w:b/>
           <w:color w:val="1E3A5F"/>
-          <w:sz w:val="36"/>
+          <w:sz w:val="34"/>
         </w:rPr>
-        <w:t>8. Next Steps</w:t>
+        <w:t>7. Next Steps</w:t>
       </w:r>
     </w:p>
     <w:p>
@@ -2833,7 +3551,7 @@
         <w:rPr>
           <w:sz w:val="21"/>
         </w:rPr>
-        <w:t>Step 5: Development begins — first module delivered within 4 weeks of kick-off.</w:t>
+        <w:t>Step 5: Development begins — first module (Phase 1 completion + Warehouse Structure) delivered within 4 weeks of kick-off.</w:t>
       </w:r>
     </w:p>
     <w:p>

</xml_diff>

<commit_message>
Expand proposal: Warehouse Structure as dedicated section with Option A/B
Section 4 now covers Warehouse Structure & Locations as a standalone
module with full architecture decision:
- Option A (Oracle Fusion Locators): 6-8 months, HIGH risk, breaking ERP change
- Option B (WMS-Managed Locators): 3-4 months, LOW risk, Fusion unchanged, recommended
- Comparison table, implementation steps, pros/cons from solution design doc

https://claude.ai/code/session_016bAVLz9TDFvTo7m6M6ouEi
</commit_message>
<xml_diff>
--- a/WMS_Implementation_Proposal.docx
+++ b/WMS_Implementation_Proposal.docx
@@ -211,19 +211,7 @@
           <w:b w:val="0"/>
           <w:sz w:val="21"/>
         </w:rPr>
-        <w:t>Gray's WMS is currently live with Phase 1 — core warehouse, shipping, printing, and Oracle Fusion integration — achieving 75% completion of Phase 1 features and 40% overall. This proposal covers the remaining work to bring the system to full maturity: completing Phase 1 in-progress items and delivering all Phase 2 modules (warehouse structure, receiving, QC, put-away, inventory, picking, dispatch, transport, returns, KPIs, labour management, and mobile devices).</w:t>
-      </w:r>
-    </w:p>
-    <w:p>
-      <w:pPr>
-        <w:spacing w:after="80"/>
-      </w:pPr>
-      <w:r>
-        <w:rPr>
-          <w:b w:val="0"/>
-          <w:sz w:val="21"/>
-        </w:rPr>
-        <w:t>Modules are delivered individually as they complete, so the business gains value continuously rather than waiting for the full six-month project to finish. Two months of on-site presence are included for go-live support, user training, and data migration.</w:t>
+        <w:t>Gray's WMS is live with Phase 1 core features, achieving 40% overall completion. This proposal covers all Phase 2 work — 20 modules — to bring the system to full maturity. The most strategically significant module is Warehouse Structure &amp; Locations, which requires an architecture decision before development begins (see Section 4). All other modules proceed in parallel and are released individually as each completes.</w:t>
       </w:r>
     </w:p>
     <w:tbl>
@@ -365,18 +353,6 @@
     </w:p>
     <w:p>
       <w:pPr>
-        <w:spacing w:after="80"/>
-      </w:pPr>
-      <w:r>
-        <w:rPr>
-          <w:b w:val="0"/>
-          <w:sz w:val="21"/>
-        </w:rPr>
-        <w:t>The current WMS is a C#/.NET 8.0 Windows Forms application with a WebView2 frontend, communicating with Oracle APEX REST APIs and Oracle Fusion via BIP SOAP.</w:t>
-      </w:r>
-    </w:p>
-    <w:p>
-      <w:pPr>
         <w:spacing w:before="200" w:after="80"/>
       </w:pPr>
       <w:r>
@@ -396,6 +372,7 @@
       </w:pPr>
       <w:r>
         <w:rPr>
+          <w:b w:val="0"/>
           <w:sz w:val="21"/>
         </w:rPr>
         <w:t>Trip Management with multi-tab interface</w:t>
@@ -409,6 +386,7 @@
       </w:pPr>
       <w:r>
         <w:rPr>
+          <w:b w:val="0"/>
           <w:sz w:val="21"/>
         </w:rPr>
         <w:t>Vehicle and Picker Management</w:t>
@@ -422,6 +400,7 @@
       </w:pPr>
       <w:r>
         <w:rPr>
+          <w:b w:val="0"/>
           <w:sz w:val="21"/>
         </w:rPr>
         <w:t>Oracle Fusion Integration (REST + BIP SOAP)</w:t>
@@ -435,6 +414,7 @@
       </w:pPr>
       <w:r>
         <w:rPr>
+          <w:b w:val="0"/>
           <w:sz w:val="21"/>
         </w:rPr>
         <w:t>Pick Release and Lot Allocation</w:t>
@@ -448,9 +428,10 @@
       </w:pPr>
       <w:r>
         <w:rPr>
+          <w:b w:val="0"/>
           <w:sz w:val="21"/>
         </w:rPr>
-        <w:t>Print Management System (Printer config, job queue, monitoring)</w:t>
+        <w:t>Print Management System (printer config, job queue, monitoring)</w:t>
       </w:r>
     </w:p>
     <w:p>
@@ -461,9 +442,10 @@
       </w:pPr>
       <w:r>
         <w:rPr>
+          <w:b w:val="0"/>
           <w:sz w:val="21"/>
         </w:rPr>
-        <w:t>Real-time fetching of pending Sales Orders and Store Requests</w:t>
+        <w:t>Real-time fetching of pending Sales Orders and Store Requests from Fusion</w:t>
       </w:r>
     </w:p>
     <w:p>
@@ -474,6 +456,7 @@
       </w:pPr>
       <w:r>
         <w:rPr>
+          <w:b w:val="0"/>
           <w:sz w:val="21"/>
         </w:rPr>
         <w:t>Assignment of Pickers, Lorries, Priorities, and Loading Bay</w:t>
@@ -487,6 +470,7 @@
       </w:pPr>
       <w:r>
         <w:rPr>
+          <w:b w:val="0"/>
           <w:sz w:val="21"/>
         </w:rPr>
         <w:t>Picking and Putaway via Mobile Applications</w:t>
@@ -500,9 +484,10 @@
       </w:pPr>
       <w:r>
         <w:rPr>
+          <w:b w:val="0"/>
           <w:sz w:val="21"/>
         </w:rPr>
-        <w:t>Ship Confirmation of Orders</w:t>
+        <w:t>Ship Confirmation of Orders with real-time Fusion update</w:t>
       </w:r>
     </w:p>
     <w:p>
@@ -513,6 +498,7 @@
       </w:pPr>
       <w:r>
         <w:rPr>
+          <w:b w:val="0"/>
           <w:sz w:val="21"/>
         </w:rPr>
         <w:t>Loading Verification via Mobile Applications</w:t>
@@ -526,9 +512,10 @@
       </w:pPr>
       <w:r>
         <w:rPr>
+          <w:b w:val="0"/>
           <w:sz w:val="21"/>
         </w:rPr>
-        <w:t>Real-time update of Picking/Shipping status into Oracle Fusion</w:t>
+        <w:t>Shipment Agent with line-count validation before printing</w:t>
       </w:r>
     </w:p>
     <w:p>
@@ -539,19 +526,7 @@
       </w:pPr>
       <w:r>
         <w:rPr>
-          <w:sz w:val="21"/>
-        </w:rPr>
-        <w:t>Printing Orders (Shipment Agent with line-count validation)</w:t>
-      </w:r>
-    </w:p>
-    <w:p>
-      <w:pPr>
-        <w:pStyle w:val="ListBullet"/>
-        <w:spacing w:after="60"/>
-        <w:ind w:left="432"/>
-      </w:pPr>
-      <w:r>
-        <w:rPr>
+          <w:b w:val="0"/>
           <w:sz w:val="21"/>
         </w:rPr>
         <w:t>Vehicle Analytics Dashboard and KPI Cards</w:t>
@@ -565,6 +540,7 @@
       </w:pPr>
       <w:r>
         <w:rPr>
+          <w:b w:val="0"/>
           <w:sz w:val="21"/>
         </w:rPr>
         <w:t>Mobile App for Pickers with Barcode/QR scanning</w:t>
@@ -578,9 +554,10 @@
       </w:pPr>
       <w:r>
         <w:rPr>
+          <w:b w:val="0"/>
           <w:sz w:val="21"/>
         </w:rPr>
-        <w:t>Role-based permissions</w:t>
+        <w:t>Role-based permissions and security</w:t>
       </w:r>
     </w:p>
     <w:p>
@@ -591,6 +568,7 @@
       </w:pPr>
       <w:r>
         <w:rPr>
+          <w:b w:val="0"/>
           <w:sz w:val="21"/>
         </w:rPr>
         <w:t>Real-time stock levels by warehouse, location, product, lot, expiry</w:t>
@@ -604,6 +582,7 @@
       </w:pPr>
       <w:r>
         <w:rPr>
+          <w:b w:val="0"/>
           <w:sz w:val="21"/>
         </w:rPr>
         <w:t>Lot traceability (FEFO), full movement history, cycle counting</w:t>
@@ -617,6 +596,21 @@
       </w:pPr>
       <w:r>
         <w:rPr>
+          <w:b w:val="0"/>
+          <w:sz w:val="21"/>
+        </w:rPr>
+        <w:t>Auto shipping documents (invoices, STV, delivery notes)</w:t>
+      </w:r>
+    </w:p>
+    <w:p>
+      <w:pPr>
+        <w:pStyle w:val="ListBullet"/>
+        <w:spacing w:after="60"/>
+        <w:ind w:left="432"/>
+      </w:pPr>
+      <w:r>
+        <w:rPr>
+          <w:b w:val="0"/>
           <w:sz w:val="21"/>
         </w:rPr>
         <w:t>Oracle ERP integration for financials &amp; order management</w:t>
@@ -630,9 +624,10 @@
       </w:pPr>
       <w:r>
         <w:rPr>
+          <w:b w:val="0"/>
           <w:sz w:val="21"/>
         </w:rPr>
-        <w:t>Auto shipping documents (invoices, STV, delivery notes)</w:t>
+        <w:t>Custom report builder; export to Excel &amp; PDF</w:t>
       </w:r>
     </w:p>
     <w:p>
@@ -645,7 +640,7 @@
           <w:color w:val="2B6CB0"/>
           <w:sz w:val="26"/>
         </w:rPr>
-        <w:t>Phase 1 — Remaining (6 items — In Progress / Planned)</w:t>
+        <w:t>Phase 1 — Remaining Items</w:t>
       </w:r>
     </w:p>
     <w:p>
@@ -656,6 +651,7 @@
       </w:pPr>
       <w:r>
         <w:rPr>
+          <w:b w:val="0"/>
           <w:sz w:val="21"/>
         </w:rPr>
         <w:t>Advanced Reporting Module (In Progress)</w:t>
@@ -669,6 +665,7 @@
       </w:pPr>
       <w:r>
         <w:rPr>
+          <w:b w:val="0"/>
           <w:sz w:val="21"/>
         </w:rPr>
         <w:t>Custom Dashboard Builder (Planned)</w:t>
@@ -682,6 +679,7 @@
       </w:pPr>
       <w:r>
         <w:rPr>
+          <w:b w:val="0"/>
           <w:sz w:val="21"/>
         </w:rPr>
         <w:t>Performance Metrics Tracking (Planned)</w:t>
@@ -695,6 +693,7 @@
       </w:pPr>
       <w:r>
         <w:rPr>
+          <w:b w:val="0"/>
           <w:sz w:val="21"/>
         </w:rPr>
         <w:t>Customer Delivery Notifications (Planned)</w:t>
@@ -708,9 +707,15 @@
       </w:pPr>
       <w:r>
         <w:rPr>
+          <w:b w:val="0"/>
           <w:sz w:val="21"/>
         </w:rPr>
         <w:t>Third-party Carrier Integration (Planned)</w:t>
+      </w:r>
+    </w:p>
+    <w:p>
+      <w:r>
+        <w:br w:type="page"/>
       </w:r>
     </w:p>
     <w:p>
@@ -723,7 +728,7 @@
           <w:color w:val="1E3A5F"/>
           <w:sz w:val="34"/>
         </w:rPr>
-        <w:t>3. Phase 2 — Full WMS Requirements (Proposed)</w:t>
+        <w:t>3. Phase 2 — Planned Modules Overview</w:t>
       </w:r>
     </w:p>
     <w:p>
@@ -735,7 +740,7 @@
           <w:b w:val="0"/>
           <w:sz w:val="21"/>
         </w:rPr>
-        <w:t>The following modules form the complete Phase 2 scope, aligned directly with the WMS roadmap defined in the application's help page. Each module is self-contained and will be released upon passing user acceptance testing.</w:t>
+        <w:t>All 20 modules below are part of Phase 2. Each module is delivered and released independently. Section 4 covers the Warehouse Structure module separately as it requires an architecture decision.</w:t>
       </w:r>
     </w:p>
     <w:tbl>
@@ -778,7 +783,7 @@
                 <w:color w:val="FFFFFF"/>
                 <w:sz w:val="18"/>
               </w:rPr>
-              <w:t>Key Features</w:t>
+              <w:t>Timeline</w:t>
             </w:r>
           </w:p>
         </w:tc>
@@ -794,7 +799,7 @@
                 <w:color w:val="FFFFFF"/>
                 <w:sz w:val="18"/>
               </w:rPr>
-              <w:t>Status</w:t>
+              <w:t>Scope Summary</w:t>
             </w:r>
           </w:p>
         </w:tc>
@@ -803,44 +808,44 @@
         <w:tc>
           <w:tcPr>
             <w:tcW w:type="dxa" w:w="3135"/>
-            <w:shd w:val="clear" w:color="auto" w:fill="f0f4fa"/>
+            <w:shd w:val="clear" w:color="auto" w:fill="fff7ed"/>
           </w:tcPr>
           <w:p>
             <w:r>
               <w:rPr>
                 <w:b/>
+                <w:color w:val="92400E"/>
                 <w:sz w:val="18"/>
               </w:rPr>
-              <w:t>AI &amp; Optimization</w:t>
+              <w:t>Warehouse Structure &amp; Locations</w:t>
             </w:r>
           </w:p>
         </w:tc>
         <w:tc>
           <w:tcPr>
             <w:tcW w:type="dxa" w:w="3135"/>
-            <w:shd w:val="clear" w:color="auto" w:fill="f0f4fa"/>
+            <w:shd w:val="clear" w:color="auto" w:fill="fff7ed"/>
+          </w:tcPr>
+          <w:p>
+            <w:r>
+              <w:rPr>
+                <w:sz w:val="18"/>
+              </w:rPr>
+              <w:t>3–4 months</w:t>
+            </w:r>
+          </w:p>
+        </w:tc>
+        <w:tc>
+          <w:tcPr>
+            <w:tcW w:type="dxa" w:w="3135"/>
+            <w:shd w:val="clear" w:color="auto" w:fill="fff7ed"/>
           </w:tcPr>
           <w:p>
             <w:r>
               <w:rPr>
                 <w:sz w:val="17"/>
               </w:rPr>
-              <w:t>AI Readiness framework, Intelligent Picker Assignment using AI, Automated Exception Handling...</w:t>
-            </w:r>
-          </w:p>
-        </w:tc>
-        <w:tc>
-          <w:tcPr>
-            <w:tcW w:type="dxa" w:w="3135"/>
-            <w:shd w:val="clear" w:color="auto" w:fill="f0f4fa"/>
-          </w:tcPr>
-          <w:p>
-            <w:r>
-              <w:rPr>
-                <w:color w:val="92400E"/>
-                <w:sz w:val="18"/>
-              </w:rPr>
-              <w:t>Planned</w:t>
+              <w:t>Architecture decision required — see Section 4</w:t>
             </w:r>
           </w:p>
         </w:tc>
@@ -857,7 +862,21 @@
                 <w:b/>
                 <w:sz w:val="18"/>
               </w:rPr>
-              <w:t>Warehouse Structure &amp; Locations</w:t>
+              <w:t>AI &amp; Optimization</w:t>
+            </w:r>
+          </w:p>
+        </w:tc>
+        <w:tc>
+          <w:tcPr>
+            <w:tcW w:type="dxa" w:w="3135"/>
+            <w:shd w:val="clear" w:color="auto" w:fill="ffffff"/>
+          </w:tcPr>
+          <w:p>
+            <w:r>
+              <w:rPr>
+                <w:sz w:val="18"/>
+              </w:rPr>
+              <w:t>Month 1–2</w:t>
             </w:r>
           </w:p>
         </w:tc>
@@ -871,22 +890,7 @@
               <w:rPr>
                 <w:sz w:val="17"/>
               </w:rPr>
-              <w:t>Manage multiple warehouses: Bonded, Duty-Paid, Pharmacy, Cosmetics, RAWS, Triage, Track stock separately for bonded vs. duty-paid status, Support storage types: drive-in racking, selective, double-deep, floor, cold storage...</w:t>
-            </w:r>
-          </w:p>
-        </w:tc>
-        <w:tc>
-          <w:tcPr>
-            <w:tcW w:type="dxa" w:w="3135"/>
-            <w:shd w:val="clear" w:color="auto" w:fill="ffffff"/>
-          </w:tcPr>
-          <w:p>
-            <w:r>
-              <w:rPr>
-                <w:color w:val="92400E"/>
-                <w:sz w:val="18"/>
-              </w:rPr>
-              <w:t>Planned</w:t>
+              <w:t>AI readiness, intelligent picker assignment, demand forecasting</w:t>
             </w:r>
           </w:p>
         </w:tc>
@@ -915,9 +919,9 @@
           <w:p>
             <w:r>
               <w:rPr>
-                <w:sz w:val="17"/>
+                <w:sz w:val="18"/>
               </w:rPr>
-              <w:t>Scan barcodes/QR codes at receipt (pallets, boxes, units), Auto-check received quantities against purchase orders, Handle partial and over-receipts...</w:t>
+              <w:t>Month 2</w:t>
             </w:r>
           </w:p>
         </w:tc>
@@ -929,10 +933,9 @@
           <w:p>
             <w:r>
               <w:rPr>
-                <w:color w:val="92400E"/>
-                <w:sz w:val="18"/>
+                <w:sz w:val="17"/>
               </w:rPr>
-              <w:t>Planned</w:t>
+              <w:t>Barcode scanning, ASN, GRN printing, partial/over-receipts</w:t>
             </w:r>
           </w:p>
         </w:tc>
@@ -961,9 +964,9 @@
           <w:p>
             <w:r>
               <w:rPr>
-                <w:sz w:val="17"/>
+                <w:sz w:val="18"/>
               </w:rPr>
-              <w:t>Set QC rules by product, supplier, or shipment, Flag items as Non-Conform or On Hold on inspection failure, Digital inspection checklists...</w:t>
+              <w:t>Month 2</w:t>
             </w:r>
           </w:p>
         </w:tc>
@@ -975,10 +978,9 @@
           <w:p>
             <w:r>
               <w:rPr>
-                <w:color w:val="92400E"/>
-                <w:sz w:val="18"/>
+                <w:sz w:val="17"/>
               </w:rPr>
-              <w:t>Planned</w:t>
+              <w:t>Digital checklists, Non-Conform flagging, auto-notifications</w:t>
             </w:r>
           </w:p>
         </w:tc>
@@ -1007,9 +1009,9 @@
           <w:p>
             <w:r>
               <w:rPr>
-                <w:sz w:val="17"/>
+                <w:sz w:val="18"/>
               </w:rPr>
-              <w:t>WMS-determined optimal location based on predefined rules, FIFO / FEFO / LIFO / ABC / zone-based storage strategies, Size, weight, hazardous materials &amp; temperature rules...</w:t>
+              <w:t>Month 2–3</w:t>
             </w:r>
           </w:p>
         </w:tc>
@@ -1021,10 +1023,9 @@
           <w:p>
             <w:r>
               <w:rPr>
-                <w:color w:val="92400E"/>
-                <w:sz w:val="18"/>
+                <w:sz w:val="17"/>
               </w:rPr>
-              <w:t>Planned</w:t>
+              <w:t>FEFO/ABC strategies, mobile-guided putaway, scan confirmation</w:t>
             </w:r>
           </w:p>
         </w:tc>
@@ -1041,7 +1042,21 @@
                 <w:b/>
                 <w:sz w:val="18"/>
               </w:rPr>
-              <w:t>Inventory Management (Enhancements)</w:t>
+              <w:t>Inventory Enhancements</w:t>
+            </w:r>
+          </w:p>
+        </w:tc>
+        <w:tc>
+          <w:tcPr>
+            <w:tcW w:type="dxa" w:w="3135"/>
+            <w:shd w:val="clear" w:color="auto" w:fill="ffffff"/>
+          </w:tcPr>
+          <w:p>
+            <w:r>
+              <w:rPr>
+                <w:sz w:val="18"/>
+              </w:rPr>
+              <w:t>Month 2</w:t>
             </w:r>
           </w:p>
         </w:tc>
@@ -1055,22 +1070,7 @@
               <w:rPr>
                 <w:sz w:val="17"/>
               </w:rPr>
-              <w:t>Replenishment triggers: at sight, minimum stock level, picking wave launch, Alerts for picking minimum levels &amp; approaching expiry dates...</w:t>
-            </w:r>
-          </w:p>
-        </w:tc>
-        <w:tc>
-          <w:tcPr>
-            <w:tcW w:type="dxa" w:w="3135"/>
-            <w:shd w:val="clear" w:color="auto" w:fill="ffffff"/>
-          </w:tcPr>
-          <w:p>
-            <w:r>
-              <w:rPr>
-                <w:color w:val="92400E"/>
-                <w:sz w:val="18"/>
-              </w:rPr>
-              <w:t>Planned</w:t>
+              <w:t>Replenishment triggers, expiry alerts</w:t>
             </w:r>
           </w:p>
         </w:tc>
@@ -1099,9 +1099,9 @@
           <w:p>
             <w:r>
               <w:rPr>
-                <w:sz w:val="17"/>
+                <w:sz w:val="18"/>
               </w:rPr>
-              <w:t>Reserve stock for specific customers or orders, Show available vs. reserved stock separately, Prevent picking reserved stock for other customers...</w:t>
+              <w:t>Month 3</w:t>
             </w:r>
           </w:p>
         </w:tc>
@@ -1113,10 +1113,9 @@
           <w:p>
             <w:r>
               <w:rPr>
-                <w:color w:val="92400E"/>
-                <w:sz w:val="18"/>
+                <w:sz w:val="17"/>
               </w:rPr>
-              <w:t>Planned</w:t>
+              <w:t>Reserve stock per customer/order, prevent over-picking</w:t>
             </w:r>
           </w:p>
         </w:tc>
@@ -1133,7 +1132,21 @@
                 <w:b/>
                 <w:sz w:val="18"/>
               </w:rPr>
-              <w:t>Order Management (Enhancements)</w:t>
+              <w:t>Order Management Enhancements</w:t>
+            </w:r>
+          </w:p>
+        </w:tc>
+        <w:tc>
+          <w:tcPr>
+            <w:tcW w:type="dxa" w:w="3135"/>
+            <w:shd w:val="clear" w:color="auto" w:fill="ffffff"/>
+          </w:tcPr>
+          <w:p>
+            <w:r>
+              <w:rPr>
+                <w:sz w:val="18"/>
+              </w:rPr>
+              <w:t>Month 3</w:t>
             </w:r>
           </w:p>
         </w:tc>
@@ -1147,22 +1160,7 @@
               <w:rPr>
                 <w:sz w:val="17"/>
               </w:rPr>
-              <w:t>Receive orders directly from customers via EDI &amp; e-commerce, Split orders: full pallets vs. less-than-full pallets...</w:t>
-            </w:r>
-          </w:p>
-        </w:tc>
-        <w:tc>
-          <w:tcPr>
-            <w:tcW w:type="dxa" w:w="3135"/>
-            <w:shd w:val="clear" w:color="auto" w:fill="ffffff"/>
-          </w:tcPr>
-          <w:p>
-            <w:r>
-              <w:rPr>
-                <w:color w:val="92400E"/>
-                <w:sz w:val="18"/>
-              </w:rPr>
-              <w:t>Planned</w:t>
+              <w:t>EDI &amp; e-commerce, pallet splitting</w:t>
             </w:r>
           </w:p>
         </w:tc>
@@ -1179,7 +1177,21 @@
                 <w:b/>
                 <w:sz w:val="18"/>
               </w:rPr>
-              <w:t>Picking (Enhancements)</w:t>
+              <w:t>Picking Enhancements</w:t>
+            </w:r>
+          </w:p>
+        </w:tc>
+        <w:tc>
+          <w:tcPr>
+            <w:tcW w:type="dxa" w:w="3135"/>
+            <w:shd w:val="clear" w:color="auto" w:fill="f0f4fa"/>
+          </w:tcPr>
+          <w:p>
+            <w:r>
+              <w:rPr>
+                <w:sz w:val="18"/>
+              </w:rPr>
+              <w:t>Month 3</w:t>
             </w:r>
           </w:p>
         </w:tc>
@@ -1193,22 +1205,7 @@
               <w:rPr>
                 <w:sz w:val="17"/>
               </w:rPr>
-              <w:t>Picking methods: single order, batch, zone, wave, cross-docking, Optimize picking routes to minimize travel time, Verify picked items by scanning; handle short picks...</w:t>
-            </w:r>
-          </w:p>
-        </w:tc>
-        <w:tc>
-          <w:tcPr>
-            <w:tcW w:type="dxa" w:w="3135"/>
-            <w:shd w:val="clear" w:color="auto" w:fill="f0f4fa"/>
-          </w:tcPr>
-          <w:p>
-            <w:r>
-              <w:rPr>
-                <w:color w:val="92400E"/>
-                <w:sz w:val="18"/>
-              </w:rPr>
-              <w:t>Planned</w:t>
+              <w:t>Wave/batch picking, route optimisation, short pick handling</w:t>
             </w:r>
           </w:p>
         </w:tc>
@@ -1225,7 +1222,21 @@
                 <w:b/>
                 <w:sz w:val="18"/>
               </w:rPr>
-              <w:t>Loading &amp; Dispatch (Enhancements)</w:t>
+              <w:t>Loading &amp; Dispatch</w:t>
+            </w:r>
+          </w:p>
+        </w:tc>
+        <w:tc>
+          <w:tcPr>
+            <w:tcW w:type="dxa" w:w="3135"/>
+            <w:shd w:val="clear" w:color="auto" w:fill="ffffff"/>
+          </w:tcPr>
+          <w:p>
+            <w:r>
+              <w:rPr>
+                <w:sz w:val="18"/>
+              </w:rPr>
+              <w:t>Month 4</w:t>
             </w:r>
           </w:p>
         </w:tc>
@@ -1239,22 +1250,7 @@
               <w:rPr>
                 <w:sz w:val="17"/>
               </w:rPr>
-              <w:t>Optimize loading sequence; verify quantities by scanning, Assign orders to vehicles &amp; drivers; check vehicle capacity, Delivery by pallets consolidation...</w:t>
-            </w:r>
-          </w:p>
-        </w:tc>
-        <w:tc>
-          <w:tcPr>
-            <w:tcW w:type="dxa" w:w="3135"/>
-            <w:shd w:val="clear" w:color="auto" w:fill="ffffff"/>
-          </w:tcPr>
-          <w:p>
-            <w:r>
-              <w:rPr>
-                <w:color w:val="92400E"/>
-                <w:sz w:val="18"/>
-              </w:rPr>
-              <w:t>Planned</w:t>
+              <w:t>Loading manifests, capacity checks, packing lists</w:t>
             </w:r>
           </w:p>
         </w:tc>
@@ -1271,7 +1267,21 @@
                 <w:b/>
                 <w:sz w:val="18"/>
               </w:rPr>
-              <w:t>Shipping (Enhancements)</w:t>
+              <w:t>Shipping Enhancements</w:t>
+            </w:r>
+          </w:p>
+        </w:tc>
+        <w:tc>
+          <w:tcPr>
+            <w:tcW w:type="dxa" w:w="3135"/>
+            <w:shd w:val="clear" w:color="auto" w:fill="f0f4fa"/>
+          </w:tcPr>
+          <w:p>
+            <w:r>
+              <w:rPr>
+                <w:sz w:val="18"/>
+              </w:rPr>
+              <w:t>Month 4</w:t>
             </w:r>
           </w:p>
         </w:tc>
@@ -1285,22 +1295,7 @@
               <w:rPr>
                 <w:sz w:val="17"/>
               </w:rPr>
-              <w:t>Automatic customer notifications when orders ship, Track proof of delivery (POD) with signatures and photos...</w:t>
-            </w:r>
-          </w:p>
-        </w:tc>
-        <w:tc>
-          <w:tcPr>
-            <w:tcW w:type="dxa" w:w="3135"/>
-            <w:shd w:val="clear" w:color="auto" w:fill="f0f4fa"/>
-          </w:tcPr>
-          <w:p>
-            <w:r>
-              <w:rPr>
-                <w:color w:val="92400E"/>
-                <w:sz w:val="18"/>
-              </w:rPr>
-              <w:t>Planned</w:t>
+              <w:t>POD with signatures &amp; photos, customer notifications</w:t>
             </w:r>
           </w:p>
         </w:tc>
@@ -1329,9 +1324,9 @@
           <w:p>
             <w:r>
               <w:rPr>
-                <w:sz w:val="17"/>
+                <w:sz w:val="18"/>
               </w:rPr>
-              <w:t>Handle empty bottle/crate returns with quantity tracking, Track deposit refunds for returnable packaging, Disposition decisions: destroy, rework, braderie, hazardous, ADV...</w:t>
+              <w:t>Month 4</w:t>
             </w:r>
           </w:p>
         </w:tc>
@@ -1343,10 +1338,9 @@
           <w:p>
             <w:r>
               <w:rPr>
-                <w:color w:val="92400E"/>
-                <w:sz w:val="18"/>
+                <w:sz w:val="17"/>
               </w:rPr>
-              <w:t>Planned</w:t>
+              <w:t>Bottle/crate returns, disposition decisions, return tracking</w:t>
             </w:r>
           </w:p>
         </w:tc>
@@ -1375,9 +1369,9 @@
           <w:p>
             <w:r>
               <w:rPr>
-                <w:sz w:val="17"/>
+                <w:sz w:val="18"/>
               </w:rPr>
-              <w:t>Inventory accuracy, picker efficiency &amp; picking accuracy, Order cycle time, on-time shipment rate, order fulfillment rate, Space utilization, stock aging, near-expiry stock alerts...</w:t>
+              <w:t>Month 4</w:t>
             </w:r>
           </w:p>
         </w:tc>
@@ -1389,10 +1383,9 @@
           <w:p>
             <w:r>
               <w:rPr>
-                <w:color w:val="92400E"/>
-                <w:sz w:val="18"/>
+                <w:sz w:val="17"/>
               </w:rPr>
-              <w:t>Planned</w:t>
+              <w:t>Picker accuracy, order cycle time, space utilisation</w:t>
             </w:r>
           </w:p>
         </w:tc>
@@ -1409,7 +1402,21 @@
                 <w:b/>
                 <w:sz w:val="18"/>
               </w:rPr>
-              <w:t>Dashboard &amp; Reporting (Enhancements)</w:t>
+              <w:t>Dashboard &amp; Reporting</w:t>
+            </w:r>
+          </w:p>
+        </w:tc>
+        <w:tc>
+          <w:tcPr>
+            <w:tcW w:type="dxa" w:w="3135"/>
+            <w:shd w:val="clear" w:color="auto" w:fill="ffffff"/>
+          </w:tcPr>
+          <w:p>
+            <w:r>
+              <w:rPr>
+                <w:sz w:val="18"/>
+              </w:rPr>
+              <w:t>Month 5</w:t>
             </w:r>
           </w:p>
         </w:tc>
@@ -1423,22 +1430,7 @@
               <w:rPr>
                 <w:sz w:val="17"/>
               </w:rPr>
-              <w:t>Customizable dashboards &amp; role-based views, Alerts &amp; notifications when KPIs breach thresholds, Scheduled automatic report generation &amp; email delivery...</w:t>
-            </w:r>
-          </w:p>
-        </w:tc>
-        <w:tc>
-          <w:tcPr>
-            <w:tcW w:type="dxa" w:w="3135"/>
-            <w:shd w:val="clear" w:color="auto" w:fill="ffffff"/>
-          </w:tcPr>
-          <w:p>
-            <w:r>
-              <w:rPr>
-                <w:color w:val="92400E"/>
-                <w:sz w:val="18"/>
-              </w:rPr>
-              <w:t>Planned</w:t>
+              <w:t>Scheduled reports, email delivery, KPI threshold alerts</w:t>
             </w:r>
           </w:p>
         </w:tc>
@@ -1467,9 +1459,9 @@
           <w:p>
             <w:r>
               <w:rPr>
-                <w:sz w:val="17"/>
+                <w:sz w:val="18"/>
               </w:rPr>
-              <w:t>Track individual and team performance, Plan and assign tasks to warehouse staff, Measure active vs. idle time; identify training needs...</w:t>
+              <w:t>Month 5</w:t>
             </w:r>
           </w:p>
         </w:tc>
@@ -1481,10 +1473,9 @@
           <w:p>
             <w:r>
               <w:rPr>
-                <w:color w:val="92400E"/>
-                <w:sz w:val="18"/>
+                <w:sz w:val="17"/>
               </w:rPr>
-              <w:t>Planned</w:t>
+              <w:t>Staff performance, task assignment, attendance tracking</w:t>
             </w:r>
           </w:p>
         </w:tc>
@@ -1513,9 +1504,9 @@
           <w:p>
             <w:r>
               <w:rPr>
-                <w:sz w:val="17"/>
+                <w:sz w:val="18"/>
               </w:rPr>
-              <w:t>Plan &amp; optimize delivery routes automatically, Track transport costs: fuel, maintenance, tyres, tolls, Assign vehicles to routes by capacity &amp; availability...</w:t>
+              <w:t>Month 5</w:t>
             </w:r>
           </w:p>
         </w:tc>
@@ -1527,10 +1518,9 @@
           <w:p>
             <w:r>
               <w:rPr>
-                <w:color w:val="92400E"/>
-                <w:sz w:val="18"/>
+                <w:sz w:val="17"/>
               </w:rPr>
-              <w:t>Planned</w:t>
+              <w:t>Route optimisation, GPS tracking, cost per delivery</w:t>
             </w:r>
           </w:p>
         </w:tc>
@@ -1559,9 +1549,9 @@
           <w:p>
             <w:r>
               <w:rPr>
-                <w:sz w:val="17"/>
+                <w:sz w:val="18"/>
               </w:rPr>
-              <w:t>Mobile app for warehouse staff (tablets &amp; handheld scanners), Barcode and QR code scanning enhancements, Offline mode with sync when back online...</w:t>
+              <w:t>Month 5</w:t>
             </w:r>
           </w:p>
         </w:tc>
@@ -1573,10 +1563,9 @@
           <w:p>
             <w:r>
               <w:rPr>
-                <w:color w:val="92400E"/>
-                <w:sz w:val="18"/>
+                <w:sz w:val="17"/>
               </w:rPr>
-              <w:t>Planned</w:t>
+              <w:t>Offline mode, rugged device support</w:t>
             </w:r>
           </w:p>
         </w:tc>
@@ -1605,9 +1594,9 @@
           <w:p>
             <w:r>
               <w:rPr>
-                <w:sz w:val="17"/>
+                <w:sz w:val="18"/>
               </w:rPr>
-              <w:t>Full audit trail — track every system change, Approval workflows for sensitive actions (stock adjustments, write-offs), Two-factor authentication for managers...</w:t>
+              <w:t>Month 6</w:t>
             </w:r>
           </w:p>
         </w:tc>
@@ -1619,10 +1608,9 @@
           <w:p>
             <w:r>
               <w:rPr>
-                <w:color w:val="92400E"/>
-                <w:sz w:val="18"/>
+                <w:sz w:val="17"/>
               </w:rPr>
-              <w:t>Planned</w:t>
+              <w:t>Full audit trail, approval workflows, 2FA for managers</w:t>
             </w:r>
           </w:p>
         </w:tc>
@@ -1639,7 +1627,21 @@
                 <w:b/>
                 <w:sz w:val="18"/>
               </w:rPr>
-              <w:t>Integration with Grays Shops</w:t>
+              <w:t>System Integration</w:t>
+            </w:r>
+          </w:p>
+        </w:tc>
+        <w:tc>
+          <w:tcPr>
+            <w:tcW w:type="dxa" w:w="3135"/>
+            <w:shd w:val="clear" w:color="auto" w:fill="f0f4fa"/>
+          </w:tcPr>
+          <w:p>
+            <w:r>
+              <w:rPr>
+                <w:sz w:val="18"/>
+              </w:rPr>
+              <w:t>Month 6</w:t>
             </w:r>
           </w:p>
         </w:tc>
@@ -1653,22 +1655,7 @@
               <w:rPr>
                 <w:sz w:val="17"/>
               </w:rPr>
-              <w:t>Product availability &amp; shortage alerts by ABC classification, Automated requisition link to referencing sent to DP...</w:t>
-            </w:r>
-          </w:p>
-        </w:tc>
-        <w:tc>
-          <w:tcPr>
-            <w:tcW w:type="dxa" w:w="3135"/>
-            <w:shd w:val="clear" w:color="auto" w:fill="f0f4fa"/>
-          </w:tcPr>
-          <w:p>
-            <w:r>
-              <w:rPr>
-                <w:color w:val="92400E"/>
-                <w:sz w:val="18"/>
-              </w:rPr>
-              <w:t>Planned</w:t>
+              <w:t>EDI, e-commerce, third-party carrier APIs</w:t>
             </w:r>
           </w:p>
         </w:tc>
@@ -1685,7 +1672,21 @@
                 <w:b/>
                 <w:sz w:val="18"/>
               </w:rPr>
-              <w:t>Implementation &amp; Support</w:t>
+              <w:t>Integration with Grays Shops</w:t>
+            </w:r>
+          </w:p>
+        </w:tc>
+        <w:tc>
+          <w:tcPr>
+            <w:tcW w:type="dxa" w:w="3135"/>
+            <w:shd w:val="clear" w:color="auto" w:fill="ffffff"/>
+          </w:tcPr>
+          <w:p>
+            <w:r>
+              <w:rPr>
+                <w:sz w:val="18"/>
+              </w:rPr>
+              <w:t>Month 6</w:t>
             </w:r>
           </w:p>
         </w:tc>
@@ -1699,22 +1700,7 @@
               <w:rPr>
                 <w:sz w:val="17"/>
               </w:rPr>
-              <w:t>Phased implementation starting with one warehouse, Training for all roles; user manuals &amp; video tutorials (English &amp; French), Ongoing support: critical issues &lt;2hrs, normal &lt;24hrs...</w:t>
-            </w:r>
-          </w:p>
-        </w:tc>
-        <w:tc>
-          <w:tcPr>
-            <w:tcW w:type="dxa" w:w="3135"/>
-            <w:shd w:val="clear" w:color="auto" w:fill="ffffff"/>
-          </w:tcPr>
-          <w:p>
-            <w:r>
-              <w:rPr>
-                <w:color w:val="92400E"/>
-                <w:sz w:val="18"/>
-              </w:rPr>
-              <w:t>Planned</w:t>
+              <w:t>Shortage alerts, automated requisitions, ABC classification</w:t>
             </w:r>
           </w:p>
         </w:tc>
@@ -1735,7 +1721,7 @@
           <w:color w:val="1E3A5F"/>
           <w:sz w:val="34"/>
         </w:rPr>
-        <w:t>4. Project Plan &amp; Timeline</w:t>
+        <w:t>4. Warehouse Structure &amp; Locations — Architecture Decision</w:t>
       </w:r>
     </w:p>
     <w:p>
@@ -1747,7 +1733,7 @@
           <w:b w:val="0"/>
           <w:sz w:val="21"/>
         </w:rPr>
-        <w:t>Modules are delivered incrementally — released to production as soon as they pass UAT. The two on-site months (Months 3–4) cover go-live support and user training for all warehouses.</w:t>
+        <w:t>This module enables physical bin-level location tracking in the warehouse — the foundation for guided picking, putaway rules, cycle counting, and route optimisation. Gray's warehouse currently tracks inventory at subinventory level only (e.g., DUTY_PAID) with no physical bin, shelf, or aisle assignment. Two architecture options exist.</w:t>
       </w:r>
     </w:p>
     <w:p>
@@ -1760,7 +1746,7 @@
           <w:color w:val="2B6CB0"/>
           <w:sz w:val="26"/>
         </w:rPr>
-        <w:t>Phase 1 Completion + Warehouse Structure  (Month 1)</w:t>
+        <w:t>Current Pain Points</w:t>
       </w:r>
     </w:p>
     <w:p>
@@ -1771,9 +1757,10 @@
       </w:pPr>
       <w:r>
         <w:rPr>
+          <w:b w:val="0"/>
           <w:sz w:val="21"/>
         </w:rPr>
-        <w:t>Complete Phase 1 remaining items: Advanced Reporting, Dashboard Builder, Customer Notifications</w:t>
+        <w:t>Pickers navigate by memory — no system-guided direction</w:t>
       </w:r>
     </w:p>
     <w:p>
@@ -1784,9 +1771,10 @@
       </w:pPr>
       <w:r>
         <w:rPr>
+          <w:b w:val="0"/>
           <w:sz w:val="21"/>
         </w:rPr>
-        <w:t>Warehouse Structure &amp; Locations module</w:t>
+        <w:t>No pick route optimisation — unnecessary walking time</w:t>
       </w:r>
     </w:p>
     <w:p>
@@ -1797,9 +1785,10 @@
       </w:pPr>
       <w:r>
         <w:rPr>
+          <w:b w:val="0"/>
           <w:sz w:val="21"/>
         </w:rPr>
-        <w:t>AI Readiness framework</w:t>
+        <w:t>No putaway rules — items placed ad-hoc</w:t>
       </w:r>
     </w:p>
     <w:p>
@@ -1810,6 +1799,1031 @@
       </w:pPr>
       <w:r>
         <w:rPr>
+          <w:b w:val="0"/>
+          <w:sz w:val="21"/>
+        </w:rPr>
+        <w:t>Cycle count is manual and blind — no location-level count</w:t>
+      </w:r>
+    </w:p>
+    <w:p>
+      <w:pPr>
+        <w:spacing w:before="200" w:after="80"/>
+      </w:pPr>
+      <w:r>
+        <w:rPr>
+          <w:b/>
+          <w:color w:val="2B6CB0"/>
+          <w:sz w:val="26"/>
+        </w:rPr>
+        <w:t>Architecture Options</w:t>
+      </w:r>
+    </w:p>
+    <w:tbl>
+      <w:tblPr>
+        <w:tblStyle w:val="TableGrid"/>
+        <w:tblW w:type="auto" w:w="0"/>
+        <w:tblLook w:firstColumn="1" w:firstRow="1" w:lastColumn="0" w:lastRow="0" w:noHBand="0" w:noVBand="1" w:val="04A0"/>
+      </w:tblPr>
+      <w:tblGrid>
+        <w:gridCol w:w="3135"/>
+        <w:gridCol w:w="3135"/>
+        <w:gridCol w:w="3135"/>
+      </w:tblGrid>
+      <w:tr>
+        <w:tc>
+          <w:tcPr>
+            <w:tcW w:type="dxa" w:w="3135"/>
+            <w:shd w:val="clear" w:color="auto" w:fill="1e3a5f"/>
+          </w:tcPr>
+          <w:p>
+            <w:r>
+              <w:rPr>
+                <w:b/>
+                <w:color w:val="FFFFFF"/>
+                <w:sz w:val="18"/>
+              </w:rPr>
+              <w:t>Criteria</w:t>
+            </w:r>
+          </w:p>
+        </w:tc>
+        <w:tc>
+          <w:tcPr>
+            <w:tcW w:type="dxa" w:w="3135"/>
+            <w:shd w:val="clear" w:color="auto" w:fill="7f1d1d"/>
+          </w:tcPr>
+          <w:p>
+            <w:r>
+              <w:rPr>
+                <w:b/>
+                <w:color w:val="FFFFFF"/>
+                <w:sz w:val="18"/>
+              </w:rPr>
+              <w:t>Option A — Oracle Fusion Locators</w:t>
+            </w:r>
+          </w:p>
+        </w:tc>
+        <w:tc>
+          <w:tcPr>
+            <w:tcW w:type="dxa" w:w="3135"/>
+            <w:shd w:val="clear" w:color="auto" w:fill="14532d"/>
+          </w:tcPr>
+          <w:p>
+            <w:r>
+              <w:rPr>
+                <w:b/>
+                <w:color w:val="FFFFFF"/>
+                <w:sz w:val="18"/>
+              </w:rPr>
+              <w:t>Option B — WMS-Managed Locators</w:t>
+            </w:r>
+          </w:p>
+        </w:tc>
+      </w:tr>
+      <w:tr>
+        <w:tc>
+          <w:tcPr>
+            <w:tcW w:type="dxa" w:w="3135"/>
+            <w:shd w:val="clear" w:color="auto" w:fill="f8fafc"/>
+          </w:tcPr>
+          <w:p>
+            <w:r>
+              <w:rPr>
+                <w:b/>
+                <w:sz w:val="18"/>
+              </w:rPr>
+              <w:t>Timeline</w:t>
+            </w:r>
+          </w:p>
+        </w:tc>
+        <w:tc>
+          <w:tcPr>
+            <w:tcW w:type="dxa" w:w="3135"/>
+            <w:shd w:val="clear" w:color="auto" w:fill="fef2f2"/>
+          </w:tcPr>
+          <w:p>
+            <w:r>
+              <w:rPr>
+                <w:sz w:val="17"/>
+              </w:rPr>
+              <w:t>6 – 8 months</w:t>
+            </w:r>
+          </w:p>
+        </w:tc>
+        <w:tc>
+          <w:tcPr>
+            <w:tcW w:type="dxa" w:w="3135"/>
+            <w:shd w:val="clear" w:color="auto" w:fill="f0fdf4"/>
+          </w:tcPr>
+          <w:p>
+            <w:r>
+              <w:rPr>
+                <w:sz w:val="17"/>
+              </w:rPr>
+              <w:t>3 – 4 months</w:t>
+            </w:r>
+          </w:p>
+        </w:tc>
+      </w:tr>
+      <w:tr>
+        <w:tc>
+          <w:tcPr>
+            <w:tcW w:type="dxa" w:w="3135"/>
+            <w:shd w:val="clear" w:color="auto" w:fill="ffffff"/>
+          </w:tcPr>
+          <w:p>
+            <w:r>
+              <w:rPr>
+                <w:b/>
+                <w:sz w:val="18"/>
+              </w:rPr>
+              <w:t>Risk to Operations</w:t>
+            </w:r>
+          </w:p>
+        </w:tc>
+        <w:tc>
+          <w:tcPr>
+            <w:tcW w:type="dxa" w:w="3135"/>
+            <w:shd w:val="clear" w:color="auto" w:fill="fef2f2"/>
+          </w:tcPr>
+          <w:p>
+            <w:r>
+              <w:rPr>
+                <w:sz w:val="17"/>
+              </w:rPr>
+              <w:t>HIGH — all-or-nothing Fusion cut-over</w:t>
+            </w:r>
+          </w:p>
+        </w:tc>
+        <w:tc>
+          <w:tcPr>
+            <w:tcW w:type="dxa" w:w="3135"/>
+            <w:shd w:val="clear" w:color="auto" w:fill="f0fdf4"/>
+          </w:tcPr>
+          <w:p>
+            <w:r>
+              <w:rPr>
+                <w:sz w:val="17"/>
+              </w:rPr>
+              <w:t>LOW — Fusion unchanged</w:t>
+            </w:r>
+          </w:p>
+        </w:tc>
+      </w:tr>
+      <w:tr>
+        <w:tc>
+          <w:tcPr>
+            <w:tcW w:type="dxa" w:w="3135"/>
+            <w:shd w:val="clear" w:color="auto" w:fill="f8fafc"/>
+          </w:tcPr>
+          <w:p>
+            <w:r>
+              <w:rPr>
+                <w:b/>
+                <w:sz w:val="18"/>
+              </w:rPr>
+              <w:t>Oracle Fusion Change</w:t>
+            </w:r>
+          </w:p>
+        </w:tc>
+        <w:tc>
+          <w:tcPr>
+            <w:tcW w:type="dxa" w:w="3135"/>
+            <w:shd w:val="clear" w:color="auto" w:fill="fef2f2"/>
+          </w:tcPr>
+          <w:p>
+            <w:r>
+              <w:rPr>
+                <w:sz w:val="17"/>
+              </w:rPr>
+              <w:t>Yes — breaking change to ALL transactions</w:t>
+            </w:r>
+          </w:p>
+        </w:tc>
+        <w:tc>
+          <w:tcPr>
+            <w:tcW w:type="dxa" w:w="3135"/>
+            <w:shd w:val="clear" w:color="auto" w:fill="f0fdf4"/>
+          </w:tcPr>
+          <w:p>
+            <w:r>
+              <w:rPr>
+                <w:sz w:val="17"/>
+              </w:rPr>
+              <w:t>None</w:t>
+            </w:r>
+          </w:p>
+        </w:tc>
+      </w:tr>
+      <w:tr>
+        <w:tc>
+          <w:tcPr>
+            <w:tcW w:type="dxa" w:w="3135"/>
+            <w:shd w:val="clear" w:color="auto" w:fill="ffffff"/>
+          </w:tcPr>
+          <w:p>
+            <w:r>
+              <w:rPr>
+                <w:b/>
+                <w:sz w:val="18"/>
+              </w:rPr>
+              <w:t>Incremental Roll-out</w:t>
+            </w:r>
+          </w:p>
+        </w:tc>
+        <w:tc>
+          <w:tcPr>
+            <w:tcW w:type="dxa" w:w="3135"/>
+            <w:shd w:val="clear" w:color="auto" w:fill="fef2f2"/>
+          </w:tcPr>
+          <w:p>
+            <w:r>
+              <w:rPr>
+                <w:sz w:val="17"/>
+              </w:rPr>
+              <w:t>No — must flip entire subinventory</w:t>
+            </w:r>
+          </w:p>
+        </w:tc>
+        <w:tc>
+          <w:tcPr>
+            <w:tcW w:type="dxa" w:w="3135"/>
+            <w:shd w:val="clear" w:color="auto" w:fill="f0fdf4"/>
+          </w:tcPr>
+          <w:p>
+            <w:r>
+              <w:rPr>
+                <w:sz w:val="17"/>
+              </w:rPr>
+              <w:t>Yes — zone by zone</w:t>
+            </w:r>
+          </w:p>
+        </w:tc>
+      </w:tr>
+      <w:tr>
+        <w:tc>
+          <w:tcPr>
+            <w:tcW w:type="dxa" w:w="3135"/>
+            <w:shd w:val="clear" w:color="auto" w:fill="f8fafc"/>
+          </w:tcPr>
+          <w:p>
+            <w:r>
+              <w:rPr>
+                <w:b/>
+                <w:sz w:val="18"/>
+              </w:rPr>
+              <w:t>Setup Complexity</w:t>
+            </w:r>
+          </w:p>
+        </w:tc>
+        <w:tc>
+          <w:tcPr>
+            <w:tcW w:type="dxa" w:w="3135"/>
+            <w:shd w:val="clear" w:color="auto" w:fill="fef2f2"/>
+          </w:tcPr>
+          <w:p>
+            <w:r>
+              <w:rPr>
+                <w:sz w:val="17"/>
+              </w:rPr>
+              <w:t>Very High — ERP config + data migration + API rewrite</w:t>
+            </w:r>
+          </w:p>
+        </w:tc>
+        <w:tc>
+          <w:tcPr>
+            <w:tcW w:type="dxa" w:w="3135"/>
+            <w:shd w:val="clear" w:color="auto" w:fill="f0fdf4"/>
+          </w:tcPr>
+          <w:p>
+            <w:r>
+              <w:rPr>
+                <w:sz w:val="17"/>
+              </w:rPr>
+              <w:t>Medium — new WMS tables &amp; mobile screen</w:t>
+            </w:r>
+          </w:p>
+        </w:tc>
+      </w:tr>
+      <w:tr>
+        <w:tc>
+          <w:tcPr>
+            <w:tcW w:type="dxa" w:w="3135"/>
+            <w:shd w:val="clear" w:color="auto" w:fill="ffffff"/>
+          </w:tcPr>
+          <w:p>
+            <w:r>
+              <w:rPr>
+                <w:b/>
+                <w:sz w:val="18"/>
+              </w:rPr>
+              <w:t>Location Management UI</w:t>
+            </w:r>
+          </w:p>
+        </w:tc>
+        <w:tc>
+          <w:tcPr>
+            <w:tcW w:type="dxa" w:w="3135"/>
+            <w:shd w:val="clear" w:color="auto" w:fill="fef2f2"/>
+          </w:tcPr>
+          <w:p>
+            <w:r>
+              <w:rPr>
+                <w:sz w:val="17"/>
+              </w:rPr>
+              <w:t>Fusion standard UI (complex)</w:t>
+            </w:r>
+          </w:p>
+        </w:tc>
+        <w:tc>
+          <w:tcPr>
+            <w:tcW w:type="dxa" w:w="3135"/>
+            <w:shd w:val="clear" w:color="auto" w:fill="f0fdf4"/>
+          </w:tcPr>
+          <w:p>
+            <w:r>
+              <w:rPr>
+                <w:sz w:val="17"/>
+              </w:rPr>
+              <w:t>Custom WMS screen (simple)</w:t>
+            </w:r>
+          </w:p>
+        </w:tc>
+      </w:tr>
+      <w:tr>
+        <w:tc>
+          <w:tcPr>
+            <w:tcW w:type="dxa" w:w="3135"/>
+            <w:shd w:val="clear" w:color="auto" w:fill="f8fafc"/>
+          </w:tcPr>
+          <w:p>
+            <w:r>
+              <w:rPr>
+                <w:b/>
+                <w:sz w:val="18"/>
+              </w:rPr>
+              <w:t>Custom Putaway Logic</w:t>
+            </w:r>
+          </w:p>
+        </w:tc>
+        <w:tc>
+          <w:tcPr>
+            <w:tcW w:type="dxa" w:w="3135"/>
+            <w:shd w:val="clear" w:color="auto" w:fill="fef2f2"/>
+          </w:tcPr>
+          <w:p>
+            <w:r>
+              <w:rPr>
+                <w:sz w:val="17"/>
+              </w:rPr>
+              <w:t>Limited (Oracle native rules only)</w:t>
+            </w:r>
+          </w:p>
+        </w:tc>
+        <w:tc>
+          <w:tcPr>
+            <w:tcW w:type="dxa" w:w="3135"/>
+            <w:shd w:val="clear" w:color="auto" w:fill="f0fdf4"/>
+          </w:tcPr>
+          <w:p>
+            <w:r>
+              <w:rPr>
+                <w:sz w:val="17"/>
+              </w:rPr>
+              <w:t>Fully customisable in WMS</w:t>
+            </w:r>
+          </w:p>
+        </w:tc>
+      </w:tr>
+      <w:tr>
+        <w:tc>
+          <w:tcPr>
+            <w:tcW w:type="dxa" w:w="3135"/>
+            <w:shd w:val="clear" w:color="auto" w:fill="ffffff"/>
+          </w:tcPr>
+          <w:p>
+            <w:r>
+              <w:rPr>
+                <w:b/>
+                <w:sz w:val="18"/>
+              </w:rPr>
+              <w:t>Audit Trail</w:t>
+            </w:r>
+          </w:p>
+        </w:tc>
+        <w:tc>
+          <w:tcPr>
+            <w:tcW w:type="dxa" w:w="3135"/>
+            <w:shd w:val="clear" w:color="auto" w:fill="fef2f2"/>
+          </w:tcPr>
+          <w:p>
+            <w:r>
+              <w:rPr>
+                <w:sz w:val="17"/>
+              </w:rPr>
+              <w:t>Native in Fusion ERP</w:t>
+            </w:r>
+          </w:p>
+        </w:tc>
+        <w:tc>
+          <w:tcPr>
+            <w:tcW w:type="dxa" w:w="3135"/>
+            <w:shd w:val="clear" w:color="auto" w:fill="f0fdf4"/>
+          </w:tcPr>
+          <w:p>
+            <w:r>
+              <w:rPr>
+                <w:sz w:val="17"/>
+              </w:rPr>
+              <w:t>WMS audit log + periodic reconciliation</w:t>
+            </w:r>
+          </w:p>
+        </w:tc>
+      </w:tr>
+      <w:tr>
+        <w:tc>
+          <w:tcPr>
+            <w:tcW w:type="dxa" w:w="3135"/>
+            <w:shd w:val="clear" w:color="auto" w:fill="f8fafc"/>
+          </w:tcPr>
+          <w:p>
+            <w:r>
+              <w:rPr>
+                <w:b/>
+                <w:sz w:val="18"/>
+              </w:rPr>
+              <w:t>Single Source of Truth</w:t>
+            </w:r>
+          </w:p>
+        </w:tc>
+        <w:tc>
+          <w:tcPr>
+            <w:tcW w:type="dxa" w:w="3135"/>
+            <w:shd w:val="clear" w:color="auto" w:fill="fef2f2"/>
+          </w:tcPr>
+          <w:p>
+            <w:r>
+              <w:rPr>
+                <w:sz w:val="17"/>
+              </w:rPr>
+              <w:t>Yes — stock at locator level in Fusion</w:t>
+            </w:r>
+          </w:p>
+        </w:tc>
+        <w:tc>
+          <w:tcPr>
+            <w:tcW w:type="dxa" w:w="3135"/>
+            <w:shd w:val="clear" w:color="auto" w:fill="f0fdf4"/>
+          </w:tcPr>
+          <w:p>
+            <w:r>
+              <w:rPr>
+                <w:sz w:val="17"/>
+              </w:rPr>
+              <w:t>No — WMS + Fusion reconciled periodically</w:t>
+            </w:r>
+          </w:p>
+        </w:tc>
+      </w:tr>
+      <w:tr>
+        <w:tc>
+          <w:tcPr>
+            <w:tcW w:type="dxa" w:w="3135"/>
+            <w:shd w:val="clear" w:color="auto" w:fill="ffffff"/>
+          </w:tcPr>
+          <w:p>
+            <w:r>
+              <w:rPr>
+                <w:b/>
+                <w:sz w:val="18"/>
+              </w:rPr>
+              <w:t>Future Oracle Compatibility</w:t>
+            </w:r>
+          </w:p>
+        </w:tc>
+        <w:tc>
+          <w:tcPr>
+            <w:tcW w:type="dxa" w:w="3135"/>
+            <w:shd w:val="clear" w:color="auto" w:fill="fef2f2"/>
+          </w:tcPr>
+          <w:p>
+            <w:r>
+              <w:rPr>
+                <w:sz w:val="17"/>
+              </w:rPr>
+              <w:t>Full native compatibility</w:t>
+            </w:r>
+          </w:p>
+        </w:tc>
+        <w:tc>
+          <w:tcPr>
+            <w:tcW w:type="dxa" w:w="3135"/>
+            <w:shd w:val="clear" w:color="auto" w:fill="f0fdf4"/>
+          </w:tcPr>
+          <w:p>
+            <w:r>
+              <w:rPr>
+                <w:sz w:val="17"/>
+              </w:rPr>
+              <w:t>Migration path to Fusion locators in Phase 3</w:t>
+            </w:r>
+          </w:p>
+        </w:tc>
+      </w:tr>
+      <w:tr>
+        <w:tc>
+          <w:tcPr>
+            <w:tcW w:type="dxa" w:w="3135"/>
+            <w:shd w:val="clear" w:color="auto" w:fill="f8fafc"/>
+          </w:tcPr>
+          <w:p>
+            <w:r>
+              <w:rPr>
+                <w:b/>
+                <w:sz w:val="18"/>
+              </w:rPr>
+              <w:t>Recommended Phase</w:t>
+            </w:r>
+          </w:p>
+        </w:tc>
+        <w:tc>
+          <w:tcPr>
+            <w:tcW w:type="dxa" w:w="3135"/>
+            <w:shd w:val="clear" w:color="auto" w:fill="fef2f2"/>
+          </w:tcPr>
+          <w:p>
+            <w:r>
+              <w:rPr>
+                <w:color w:val="92400E"/>
+                <w:sz w:val="17"/>
+              </w:rPr>
+              <w:t>Phase 3 — Future state</w:t>
+            </w:r>
+          </w:p>
+        </w:tc>
+        <w:tc>
+          <w:tcPr>
+            <w:tcW w:type="dxa" w:w="3135"/>
+            <w:shd w:val="clear" w:color="auto" w:fill="dcfce7"/>
+          </w:tcPr>
+          <w:p>
+            <w:r>
+              <w:rPr>
+                <w:b/>
+                <w:color w:val="276E48"/>
+                <w:sz w:val="17"/>
+              </w:rPr>
+              <w:t>Phase 2 — Implement Now (Recommended)</w:t>
+            </w:r>
+          </w:p>
+        </w:tc>
+      </w:tr>
+    </w:tbl>
+    <w:p>
+      <w:pPr>
+        <w:spacing w:before="200" w:after="80"/>
+      </w:pPr>
+      <w:r>
+        <w:rPr>
+          <w:b/>
+          <w:color w:val="B91C1C"/>
+          <w:sz w:val="26"/>
+        </w:rPr>
+        <w:t>Option A — Enable Oracle Fusion Locators</w:t>
+      </w:r>
+    </w:p>
+    <w:p>
+      <w:pPr>
+        <w:spacing w:after="80"/>
+      </w:pPr>
+      <w:r>
+        <w:rPr>
+          <w:b w:val="0"/>
+          <w:sz w:val="21"/>
+        </w:rPr>
+        <w:t>Configure Oracle Fusion Inventory to enforce locator-level stock tracking. Every inbound and outbound transaction must reference a physical bin locator in Fusion. This is the 'single source of truth' approach — but it is a significant ERP project.</w:t>
+      </w:r>
+    </w:p>
+    <w:p>
+      <w:pPr>
+        <w:spacing w:before="160" w:after="60"/>
+      </w:pPr>
+      <w:r>
+        <w:rPr>
+          <w:b/>
+          <w:color w:val="1E3A5F"/>
+          <w:sz w:val="22"/>
+        </w:rPr>
+        <w:t>What needs to be done in Fusion:</w:t>
+      </w:r>
+    </w:p>
+    <w:p>
+      <w:pPr>
+        <w:pStyle w:val="ListBullet"/>
+        <w:spacing w:after="60"/>
+        <w:ind w:left="432"/>
+      </w:pPr>
+      <w:r>
+        <w:rPr>
+          <w:b w:val="0"/>
+          <w:sz w:val="21"/>
+        </w:rPr>
+        <w:t>Step 1 — Define ALL physical locations in Fusion: Organisation → Subinventory → Zone → Locator (e.g., A-03-2-B). Set capacity, weight, dimensions per locator.</w:t>
+      </w:r>
+    </w:p>
+    <w:p>
+      <w:pPr>
+        <w:pStyle w:val="ListBullet"/>
+        <w:spacing w:after="60"/>
+        <w:ind w:left="432"/>
+      </w:pPr>
+      <w:r>
+        <w:rPr>
+          <w:b w:val="0"/>
+          <w:sz w:val="21"/>
+        </w:rPr>
+        <w:t>Step 2 — Enable Locator Control on the DUTY_PAID subinventory. Once enabled, ALL transactions must include a locator — no partial rollout.</w:t>
+      </w:r>
+    </w:p>
+    <w:p>
+      <w:pPr>
+        <w:pStyle w:val="ListBullet"/>
+        <w:spacing w:after="60"/>
+        <w:ind w:left="432"/>
+      </w:pPr>
+      <w:r>
+        <w:rPr>
+          <w:b w:val="0"/>
+          <w:sz w:val="21"/>
+        </w:rPr>
+        <w:t>Step 3 — Stock migration: physically scan and map every item to a Fusion locator. All on-hand balances must be reassigned — this is a warehouse freeze event.</w:t>
+      </w:r>
+    </w:p>
+    <w:p>
+      <w:pPr>
+        <w:spacing w:before="160" w:after="60"/>
+      </w:pPr>
+      <w:r>
+        <w:rPr>
+          <w:b/>
+          <w:color w:val="1E3A5F"/>
+          <w:sz w:val="22"/>
+        </w:rPr>
+        <w:t>Key risks:</w:t>
+      </w:r>
+    </w:p>
+    <w:p>
+      <w:pPr>
+        <w:pStyle w:val="ListBullet"/>
+        <w:spacing w:after="60"/>
+        <w:ind w:left="432"/>
+      </w:pPr>
+      <w:r>
+        <w:rPr>
+          <w:b w:val="0"/>
+          <w:sz w:val="21"/>
+        </w:rPr>
+        <w:t>All WMS API calls must be rewritten to include Locator ID — breaking change across the entire application</w:t>
+      </w:r>
+    </w:p>
+    <w:p>
+      <w:pPr>
+        <w:pStyle w:val="ListBullet"/>
+        <w:spacing w:after="60"/>
+        <w:ind w:left="432"/>
+      </w:pPr>
+      <w:r>
+        <w:rPr>
+          <w:b w:val="0"/>
+          <w:sz w:val="21"/>
+        </w:rPr>
+        <w:t>Cannot roll out incrementally — the entire subinventory flips at once</w:t>
+      </w:r>
+    </w:p>
+    <w:p>
+      <w:pPr>
+        <w:pStyle w:val="ListBullet"/>
+        <w:spacing w:after="60"/>
+        <w:ind w:left="432"/>
+      </w:pPr>
+      <w:r>
+        <w:rPr>
+          <w:b w:val="0"/>
+          <w:sz w:val="21"/>
+        </w:rPr>
+        <w:t>Requires ERP change freeze, full UAT, and regression testing on financial transactions</w:t>
+      </w:r>
+    </w:p>
+    <w:p>
+      <w:pPr>
+        <w:pStyle w:val="ListBullet"/>
+        <w:spacing w:after="60"/>
+        <w:ind w:left="432"/>
+      </w:pPr>
+      <w:r>
+        <w:rPr>
+          <w:b w:val="0"/>
+          <w:sz w:val="21"/>
+        </w:rPr>
+        <w:t>Timeline: 6 – 8 months before go-live</w:t>
+      </w:r>
+    </w:p>
+    <w:p>
+      <w:pPr>
+        <w:spacing w:before="200" w:after="80"/>
+      </w:pPr>
+      <w:r>
+        <w:rPr>
+          <w:b/>
+          <w:color w:val="276E48"/>
+          <w:sz w:val="26"/>
+        </w:rPr>
+        <w:t>Option B — WMS-Managed Locators (Recommended)</w:t>
+      </w:r>
+    </w:p>
+    <w:p>
+      <w:pPr>
+        <w:spacing w:after="80"/>
+      </w:pPr>
+      <w:r>
+        <w:rPr>
+          <w:b w:val="0"/>
+          <w:sz w:val="21"/>
+        </w:rPr>
+        <w:t>WMS owns the physical location layer. Oracle Fusion continues to track stock at subinventory level only (unchanged). A parallel location database in WMS tracks exactly which bin each item is in. Periodic reconciliation keeps WMS and Fusion totals aligned.</w:t>
+      </w:r>
+    </w:p>
+    <w:p>
+      <w:pPr>
+        <w:spacing w:before="160" w:after="60"/>
+      </w:pPr>
+      <w:r>
+        <w:rPr>
+          <w:b/>
+          <w:color w:val="1E3A5F"/>
+          <w:sz w:val="22"/>
+        </w:rPr>
+        <w:t>Architecture:</w:t>
+      </w:r>
+    </w:p>
+    <w:p>
+      <w:pPr>
+        <w:pStyle w:val="ListBullet"/>
+        <w:spacing w:after="60"/>
+        <w:ind w:left="432"/>
+      </w:pPr>
+      <w:r>
+        <w:rPr>
+          <w:b w:val="0"/>
+          <w:sz w:val="21"/>
+        </w:rPr>
+        <w:t>New Oracle APEX tables: WMS_LOCATIONS, WMS_LOCATION_STOCK, WMS_LOCATION_MOVES, WMS_PICK_ROUTES</w:t>
+      </w:r>
+    </w:p>
+    <w:p>
+      <w:pPr>
+        <w:pStyle w:val="ListBullet"/>
+        <w:spacing w:after="60"/>
+        <w:ind w:left="432"/>
+      </w:pPr>
+      <w:r>
+        <w:rPr>
+          <w:b w:val="0"/>
+          <w:sz w:val="21"/>
+        </w:rPr>
+        <w:t>Fusion knows: '10 units in DUTY_PAID' — WMS knows: '10 units in A-03-2-B'</w:t>
+      </w:r>
+    </w:p>
+    <w:p>
+      <w:pPr>
+        <w:pStyle w:val="ListBullet"/>
+        <w:spacing w:after="60"/>
+        <w:ind w:left="432"/>
+      </w:pPr>
+      <w:r>
+        <w:rPr>
+          <w:b w:val="0"/>
+          <w:sz w:val="21"/>
+        </w:rPr>
+        <w:t>Receiving: Fusion receives to subinventory → WMS records putaway locator via mobile scan</w:t>
+      </w:r>
+    </w:p>
+    <w:p>
+      <w:pPr>
+        <w:pStyle w:val="ListBullet"/>
+        <w:spacing w:after="60"/>
+        <w:ind w:left="432"/>
+      </w:pPr>
+      <w:r>
+        <w:rPr>
+          <w:b w:val="0"/>
+          <w:sz w:val="21"/>
+        </w:rPr>
+        <w:t>Picking: WMS selects locator (FIFO) → mobile shows 'Go to A-03-2-B' → picker scans bin → WMS deducts → Fusion issues from subinventory on ship confirm</w:t>
+      </w:r>
+    </w:p>
+    <w:p>
+      <w:pPr>
+        <w:pStyle w:val="ListBullet"/>
+        <w:spacing w:after="60"/>
+        <w:ind w:left="432"/>
+      </w:pPr>
+      <w:r>
+        <w:rPr>
+          <w:b w:val="0"/>
+          <w:sz w:val="21"/>
+        </w:rPr>
+        <w:t>Reconciliation: daily comparison of WMS locator totals vs Fusion subinventory totals; discrepancies flagged for adjustment</w:t>
+      </w:r>
+    </w:p>
+    <w:p>
+      <w:pPr>
+        <w:spacing w:before="160" w:after="60"/>
+      </w:pPr>
+      <w:r>
+        <w:rPr>
+          <w:b/>
+          <w:color w:val="1E3A5F"/>
+          <w:sz w:val="22"/>
+        </w:rPr>
+        <w:t>Implementation steps (3–4 months):</w:t>
+      </w:r>
+    </w:p>
+    <w:p>
+      <w:pPr>
+        <w:pStyle w:val="ListBullet"/>
+        <w:spacing w:after="60"/>
+        <w:ind w:left="432"/>
+      </w:pPr>
+      <w:r>
+        <w:rPr>
+          <w:b w:val="0"/>
+          <w:sz w:val="21"/>
+        </w:rPr>
+        <w:t>Week 1–4: Foundation — location data model, Location Management screen in WMS, REST APIs</w:t>
+      </w:r>
+    </w:p>
+    <w:p>
+      <w:pPr>
+        <w:pStyle w:val="ListBullet"/>
+        <w:spacing w:after="60"/>
+        <w:ind w:left="432"/>
+      </w:pPr>
+      <w:r>
+        <w:rPr>
+          <w:b w:val="0"/>
+          <w:sz w:val="21"/>
+        </w:rPr>
+        <w:t>Week 5–7: Putaway integration — WMS suggestion engine, mobile scan-to-confirm, receiving flow</w:t>
+      </w:r>
+    </w:p>
+    <w:p>
+      <w:pPr>
+        <w:pStyle w:val="ListBullet"/>
+        <w:spacing w:after="60"/>
+        <w:ind w:left="432"/>
+      </w:pPr>
+      <w:r>
+        <w:rPr>
+          <w:b w:val="0"/>
+          <w:sz w:val="21"/>
+        </w:rPr>
+        <w:t>Week 8–10: Guided picking — FIFO locator selection, mobile 'Go to bin' instructions, scan confirmation</w:t>
+      </w:r>
+    </w:p>
+    <w:p>
+      <w:pPr>
+        <w:pStyle w:val="ListBullet"/>
+        <w:spacing w:after="60"/>
+        <w:ind w:left="432"/>
+      </w:pPr>
+      <w:r>
+        <w:rPr>
+          <w:b w:val="0"/>
+          <w:sz w:val="21"/>
+        </w:rPr>
+        <w:t>Week 11–12: Reconciliation &amp; reporting — discrepancy alerts, cycle count tasks, utilisation dashboard</w:t>
+      </w:r>
+    </w:p>
+    <w:p>
+      <w:pPr>
+        <w:pStyle w:val="ListBullet"/>
+        <w:spacing w:after="60"/>
+        <w:ind w:left="432"/>
+      </w:pPr>
+      <w:r>
+        <w:rPr>
+          <w:b w:val="0"/>
+          <w:sz w:val="21"/>
+        </w:rPr>
+        <w:t>Phase 3 (future): Migrate WMS locator data to Fusion when Fusion locators are fully barcoded and configured</w:t>
+      </w:r>
+    </w:p>
+    <w:p>
+      <w:pPr>
+        <w:spacing w:before="160" w:after="60"/>
+      </w:pPr>
+      <w:r>
+        <w:rPr>
+          <w:b/>
+          <w:color w:val="1E3A5F"/>
+          <w:sz w:val="22"/>
+        </w:rPr>
+        <w:t>Recommendation: Start with Option B, evolve to Option A in Phase 3</w:t>
+      </w:r>
+    </w:p>
+    <w:p>
+      <w:pPr>
+        <w:spacing w:after="80"/>
+      </w:pPr>
+      <w:r>
+        <w:rPr>
+          <w:b w:val="0"/>
+          <w:color w:val="276E48"/>
+          <w:sz w:val="21"/>
+        </w:rPr>
+        <w:t>Option B delivers bin-level picking guidance 4 months faster with zero risk to Oracle Fusion transactions. The WMS data model is designed to map cleanly to Fusion locators when the business is ready for Phase 3 migration.</w:t>
+      </w:r>
+    </w:p>
+    <w:p>
+      <w:r>
+        <w:br w:type="page"/>
+      </w:r>
+    </w:p>
+    <w:p>
+      <w:pPr>
+        <w:spacing w:before="320" w:after="120"/>
+      </w:pPr>
+      <w:r>
+        <w:rPr>
+          <w:b/>
+          <w:color w:val="1E3A5F"/>
+          <w:sz w:val="34"/>
+        </w:rPr>
+        <w:t>5. Project Plan &amp; Timeline</w:t>
+      </w:r>
+    </w:p>
+    <w:p>
+      <w:pPr>
+        <w:spacing w:after="80"/>
+      </w:pPr>
+      <w:r>
+        <w:rPr>
+          <w:b w:val="0"/>
+          <w:sz w:val="21"/>
+        </w:rPr>
+        <w:t>Modules are released individually as they pass UAT. On-site months (3–4) cover go-live support and user training. The Warehouse Structure module runs across Months 2–5 (Option B) or Months 2–9 (Option A).</w:t>
+      </w:r>
+    </w:p>
+    <w:p>
+      <w:pPr>
+        <w:spacing w:before="200" w:after="80"/>
+      </w:pPr>
+      <w:r>
+        <w:rPr>
+          <w:b/>
+          <w:color w:val="2B6CB0"/>
+          <w:sz w:val="26"/>
+        </w:rPr>
+        <w:t>Month 1 — Phase 1 Completion + AI Foundation</w:t>
+      </w:r>
+    </w:p>
+    <w:p>
+      <w:pPr>
+        <w:pStyle w:val="ListBullet"/>
+        <w:spacing w:after="60"/>
+        <w:ind w:left="432"/>
+      </w:pPr>
+      <w:r>
+        <w:rPr>
+          <w:b w:val="0"/>
+          <w:sz w:val="21"/>
+        </w:rPr>
+        <w:t>Complete Phase 1 remaining: Advanced Reporting, Dashboard Builder, Customer Notifications</w:t>
+      </w:r>
+    </w:p>
+    <w:p>
+      <w:pPr>
+        <w:pStyle w:val="ListBullet"/>
+        <w:spacing w:after="60"/>
+        <w:ind w:left="432"/>
+      </w:pPr>
+      <w:r>
+        <w:rPr>
+          <w:b w:val="0"/>
+          <w:sz w:val="21"/>
+        </w:rPr>
+        <w:t>AI Readiness framework and intelligent picker assignment foundations</w:t>
+      </w:r>
+    </w:p>
+    <w:p>
+      <w:pPr>
+        <w:pStyle w:val="ListBullet"/>
+        <w:spacing w:after="60"/>
+        <w:ind w:left="432"/>
+      </w:pPr>
+      <w:r>
+        <w:rPr>
+          <w:b w:val="0"/>
           <w:sz w:val="21"/>
         </w:rPr>
         <w:t>Auto-updater and release pipeline</w:t>
@@ -1825,7 +2839,7 @@
           <w:color w:val="2B6CB0"/>
           <w:sz w:val="26"/>
         </w:rPr>
-        <w:t>Receiving + QC + Put-Away  (Month 2)</w:t>
+        <w:t>Month 2 — Receiving + QC + Put-Away + Warehouse Foundation</w:t>
       </w:r>
     </w:p>
     <w:p>
@@ -1836,9 +2850,10 @@
       </w:pPr>
       <w:r>
         <w:rPr>
+          <w:b w:val="0"/>
           <w:sz w:val="21"/>
         </w:rPr>
-        <w:t>Receiving Goods module (barcode scanning, ASN, GRN printing)</w:t>
+        <w:t>Receiving Goods module (barcode scanning, ASN, GRN printing, partial/over-receipts)</w:t>
       </w:r>
     </w:p>
     <w:p>
@@ -1849,9 +2864,10 @@
       </w:pPr>
       <w:r>
         <w:rPr>
+          <w:b w:val="0"/>
           <w:sz w:val="21"/>
         </w:rPr>
-        <w:t>Quality Control module (checklists, Non-Conform flagging)</w:t>
+        <w:t>Quality Control module (digital checklists, Non-Conform flagging)</w:t>
       </w:r>
     </w:p>
     <w:p>
@@ -1862,6 +2878,7 @@
       </w:pPr>
       <w:r>
         <w:rPr>
+          <w:b w:val="0"/>
           <w:sz w:val="21"/>
         </w:rPr>
         <w:t>Put-Away module (FEFO/ABC strategies, mobile-guided)</w:t>
@@ -1875,9 +2892,24 @@
       </w:pPr>
       <w:r>
         <w:rPr>
+          <w:b w:val="0"/>
           <w:sz w:val="21"/>
         </w:rPr>
-        <w:t>Inventory Management enhancements (replenishment triggers)</w:t>
+        <w:t>Warehouse Structure: Step 1 — Location data model &amp; Location Management screen</w:t>
+      </w:r>
+    </w:p>
+    <w:p>
+      <w:pPr>
+        <w:pStyle w:val="ListBullet"/>
+        <w:spacing w:after="60"/>
+        <w:ind w:left="432"/>
+      </w:pPr>
+      <w:r>
+        <w:rPr>
+          <w:b w:val="0"/>
+          <w:sz w:val="21"/>
+        </w:rPr>
+        <w:t>Inventory Management enhancements (replenishment triggers, expiry alerts)</w:t>
       </w:r>
     </w:p>
     <w:p>
@@ -1890,7 +2922,7 @@
           <w:color w:val="2B6CB0"/>
           <w:sz w:val="26"/>
         </w:rPr>
-        <w:t>Stock Reservation + Order Management + Picking (ON-SITE begins)  (Month 3)</w:t>
+        <w:t>Month 3 — Stock / OM / Picking + Warehouse Putaway Flow (ON-SITE begins)</w:t>
       </w:r>
     </w:p>
     <w:p>
@@ -1901,6 +2933,7 @@
       </w:pPr>
       <w:r>
         <w:rPr>
+          <w:b w:val="0"/>
           <w:sz w:val="21"/>
         </w:rPr>
         <w:t>Stock Reservation module</w:t>
@@ -1914,6 +2947,7 @@
       </w:pPr>
       <w:r>
         <w:rPr>
+          <w:b w:val="0"/>
           <w:sz w:val="21"/>
         </w:rPr>
         <w:t>Order Management enhancements (EDI, pallet splitting)</w:t>
@@ -1927,9 +2961,10 @@
       </w:pPr>
       <w:r>
         <w:rPr>
+          <w:b w:val="0"/>
           <w:sz w:val="21"/>
         </w:rPr>
-        <w:t>Picking enhancements (wave/batch picking, route optimization)</w:t>
+        <w:t>Picking enhancements (wave/batch, route optimisation, short pick handling)</w:t>
       </w:r>
     </w:p>
     <w:p>
@@ -1940,9 +2975,24 @@
       </w:pPr>
       <w:r>
         <w:rPr>
+          <w:b w:val="0"/>
           <w:sz w:val="21"/>
         </w:rPr>
-        <w:t>ON-SITE: go-live support for Months 1–2 modules, user training</w:t>
+        <w:t>Warehouse Structure: Step 2 — Putaway integration (WMS suggestion engine, mobile scan)</w:t>
+      </w:r>
+    </w:p>
+    <w:p>
+      <w:pPr>
+        <w:pStyle w:val="ListBullet"/>
+        <w:spacing w:after="60"/>
+        <w:ind w:left="432"/>
+      </w:pPr>
+      <w:r>
+        <w:rPr>
+          <w:b w:val="0"/>
+          <w:sz w:val="21"/>
+        </w:rPr>
+        <w:t>ON-SITE: go-live support for Months 1–2 modules, user training sessions</w:t>
       </w:r>
     </w:p>
     <w:p>
@@ -1955,7 +3005,7 @@
           <w:color w:val="2B6CB0"/>
           <w:sz w:val="26"/>
         </w:rPr>
-        <w:t>Loading + Shipping + Returns + KPIs (ON-SITE)  (Month 4)</w:t>
+        <w:t>Month 4 — Loading + Shipping + Returns + KPIs + Guided Picking (ON-SITE)</w:t>
       </w:r>
     </w:p>
     <w:p>
@@ -1966,6 +3016,7 @@
       </w:pPr>
       <w:r>
         <w:rPr>
+          <w:b w:val="0"/>
           <w:sz w:val="21"/>
         </w:rPr>
         <w:t>Loading &amp; Dispatch enhancements (manifests, capacity checks)</w:t>
@@ -1979,9 +3030,10 @@
       </w:pPr>
       <w:r>
         <w:rPr>
+          <w:b w:val="0"/>
           <w:sz w:val="21"/>
         </w:rPr>
-        <w:t>Shipping enhancements (POD with signatures/photos)</w:t>
+        <w:t>Shipping enhancements (POD with signatures &amp; photos)</w:t>
       </w:r>
     </w:p>
     <w:p>
@@ -1992,6 +3044,7 @@
       </w:pPr>
       <w:r>
         <w:rPr>
+          <w:b w:val="0"/>
           <w:sz w:val="21"/>
         </w:rPr>
         <w:t>Returns &amp; Reverse Logistics module</w:t>
@@ -2005,6 +3058,7 @@
       </w:pPr>
       <w:r>
         <w:rPr>
+          <w:b w:val="0"/>
           <w:sz w:val="21"/>
         </w:rPr>
         <w:t>Performance Tracking (KPIs) module</w:t>
@@ -2018,9 +3072,24 @@
       </w:pPr>
       <w:r>
         <w:rPr>
+          <w:b w:val="0"/>
           <w:sz w:val="21"/>
         </w:rPr>
-        <w:t>ON-SITE: continued training, hypercare support</w:t>
+        <w:t>Warehouse Structure: Step 3 — Guided picking ('Go to A-03-2-B'), bin scan confirmation</w:t>
+      </w:r>
+    </w:p>
+    <w:p>
+      <w:pPr>
+        <w:pStyle w:val="ListBullet"/>
+        <w:spacing w:after="60"/>
+        <w:ind w:left="432"/>
+      </w:pPr>
+      <w:r>
+        <w:rPr>
+          <w:b w:val="0"/>
+          <w:sz w:val="21"/>
+        </w:rPr>
+        <w:t>ON-SITE: continued training, hypercare support across all modules</w:t>
       </w:r>
     </w:p>
     <w:p>
@@ -2033,7 +3102,7 @@
           <w:color w:val="2B6CB0"/>
           <w:sz w:val="26"/>
         </w:rPr>
-        <w:t>Dashboard + Labour + Transport + Mobile  (Month 5)</w:t>
+        <w:t>Month 5 — Dashboard + Labour + Transport + Mobile + Warehouse Reconciliation</w:t>
       </w:r>
     </w:p>
     <w:p>
@@ -2044,9 +3113,10 @@
       </w:pPr>
       <w:r>
         <w:rPr>
+          <w:b w:val="0"/>
           <w:sz w:val="21"/>
         </w:rPr>
-        <w:t>Dashboard &amp; Reporting enhancements (scheduled reports, alerts)</w:t>
+        <w:t>Dashboard &amp; Reporting enhancements (scheduled reports, email delivery)</w:t>
       </w:r>
     </w:p>
     <w:p>
@@ -2057,9 +3127,10 @@
       </w:pPr>
       <w:r>
         <w:rPr>
+          <w:b w:val="0"/>
           <w:sz w:val="21"/>
         </w:rPr>
-        <w:t>Labour Management module</w:t>
+        <w:t>Labour Management module (performance, attendance, task assignment)</w:t>
       </w:r>
     </w:p>
     <w:p>
@@ -2070,9 +3141,10 @@
       </w:pPr>
       <w:r>
         <w:rPr>
+          <w:b w:val="0"/>
           <w:sz w:val="21"/>
         </w:rPr>
-        <w:t>Transport Management module (route optimization, GPS integration)</w:t>
+        <w:t>Transport Management module (route optimisation, GPS integration)</w:t>
       </w:r>
     </w:p>
     <w:p>
@@ -2083,9 +3155,24 @@
       </w:pPr>
       <w:r>
         <w:rPr>
+          <w:b w:val="0"/>
           <w:sz w:val="21"/>
         </w:rPr>
-        <w:t>Mobile Devices &amp; Scanning enhancements (offline mode)</w:t>
+        <w:t>Mobile Devices &amp; Scanning enhancements (offline mode, rugged device support)</w:t>
+      </w:r>
+    </w:p>
+    <w:p>
+      <w:pPr>
+        <w:pStyle w:val="ListBullet"/>
+        <w:spacing w:after="60"/>
+        <w:ind w:left="432"/>
+      </w:pPr>
+      <w:r>
+        <w:rPr>
+          <w:b w:val="0"/>
+          <w:sz w:val="21"/>
+        </w:rPr>
+        <w:t>Warehouse Structure: Step 4 — Reconciliation dashboard, cycle count, utilisation reports</w:t>
       </w:r>
     </w:p>
     <w:p>
@@ -2098,7 +3185,7 @@
           <w:color w:val="2B6CB0"/>
           <w:sz w:val="26"/>
         </w:rPr>
-        <w:t>Security + Integration + Stabilisation  (Month 6)</w:t>
+        <w:t>Month 6 — Security + Integration + Stabilisation</w:t>
       </w:r>
     </w:p>
     <w:p>
@@ -2109,6 +3196,7 @@
       </w:pPr>
       <w:r>
         <w:rPr>
+          <w:b w:val="0"/>
           <w:sz w:val="21"/>
         </w:rPr>
         <w:t>User Access &amp; Security (audit trail, 2FA, approval workflows)</w:t>
@@ -2122,9 +3210,10 @@
       </w:pPr>
       <w:r>
         <w:rPr>
+          <w:b w:val="0"/>
           <w:sz w:val="21"/>
         </w:rPr>
-        <w:t>System Integration enhancements (EDI, e-commerce)</w:t>
+        <w:t>System Integration enhancements (EDI, e-commerce, third-party carriers)</w:t>
       </w:r>
     </w:p>
     <w:p>
@@ -2135,9 +3224,10 @@
       </w:pPr>
       <w:r>
         <w:rPr>
+          <w:b w:val="0"/>
           <w:sz w:val="21"/>
         </w:rPr>
-        <w:t>Integration with Grays Shops (shortage alerts, requisitions)</w:t>
+        <w:t>Integration with Grays Shops (shortage alerts, ABC classification, requisitions)</w:t>
       </w:r>
     </w:p>
     <w:p>
@@ -2148,6 +3238,7 @@
       </w:pPr>
       <w:r>
         <w:rPr>
+          <w:b w:val="0"/>
           <w:sz w:val="21"/>
         </w:rPr>
         <w:t>Regression testing across all modules</w:t>
@@ -2161,6 +3252,7 @@
       </w:pPr>
       <w:r>
         <w:rPr>
+          <w:b w:val="0"/>
           <w:sz w:val="21"/>
         </w:rPr>
         <w:t>Documentation, user manuals (English &amp; French), knowledge transfer</w:t>
@@ -2174,9 +3266,10 @@
       </w:pPr>
       <w:r>
         <w:rPr>
+          <w:b w:val="0"/>
           <w:sz w:val="21"/>
         </w:rPr>
-        <w:t>Final release with versioned deployment package</w:t>
+        <w:t>Final versioned release package</w:t>
       </w:r>
     </w:p>
     <w:p>
@@ -2189,7 +3282,7 @@
           <w:color w:val="2B6CB0"/>
           <w:sz w:val="26"/>
         </w:rPr>
-        <w:t>High-Level Gantt Summary</w:t>
+        <w:t>High-Level Gantt</w:t>
       </w:r>
     </w:p>
     <w:tbl>
@@ -2350,7 +3443,7 @@
               <w:rPr>
                 <w:sz w:val="17"/>
               </w:rPr>
-              <w:t>Phase 1 Completion + Warehouse</w:t>
+              <w:t>Phase 1 Completion + AI</w:t>
             </w:r>
           </w:p>
         </w:tc>
@@ -2557,7 +3650,7 @@
               <w:rPr>
                 <w:sz w:val="17"/>
               </w:rPr>
-              <w:t>Loading / Shipping / Returns / KPIs</w:t>
+              <w:t>Loading / Shipping / Returns</w:t>
             </w:r>
           </w:p>
         </w:tc>
@@ -2626,7 +3719,7 @@
               <w:rPr>
                 <w:sz w:val="17"/>
               </w:rPr>
-              <w:t>Dashboard / Labour / Transport / Mobile</w:t>
+              <w:t>Dashboard / Labour / Transport</w:t>
             </w:r>
           </w:p>
         </w:tc>
@@ -2695,7 +3788,7 @@
               <w:rPr>
                 <w:sz w:val="17"/>
               </w:rPr>
-              <w:t>Security / Integration / Stabilisation</w:t>
+              <w:t>Security / Integration</w:t>
             </w:r>
           </w:p>
         </w:tc>
@@ -2751,6 +3844,108 @@
               <w:t>●</w:t>
             </w:r>
           </w:p>
+        </w:tc>
+      </w:tr>
+      <w:tr>
+        <w:tc>
+          <w:tcPr>
+            <w:tcW w:type="dxa" w:w="1344"/>
+            <w:shd w:val="clear" w:color="auto" w:fill="f8fafc"/>
+          </w:tcPr>
+          <w:p>
+            <w:r>
+              <w:rPr>
+                <w:sz w:val="17"/>
+              </w:rPr>
+              <w:t>Warehouse Structure (Option B)</w:t>
+            </w:r>
+          </w:p>
+        </w:tc>
+        <w:tc>
+          <w:tcPr>
+            <w:tcW w:type="dxa" w:w="1344"/>
+            <w:shd w:val="clear" w:color="auto" w:fill="ffffff"/>
+          </w:tcPr>
+          <w:p/>
+        </w:tc>
+        <w:tc>
+          <w:tcPr>
+            <w:tcW w:type="dxa" w:w="1344"/>
+            <w:shd w:val="clear" w:color="auto" w:fill="92400e"/>
+          </w:tcPr>
+          <w:p>
+            <w:pPr>
+              <w:jc w:val="center"/>
+            </w:pPr>
+            <w:r>
+              <w:rPr>
+                <w:color w:val="FFFFFF"/>
+                <w:sz w:val="18"/>
+              </w:rPr>
+              <w:t>●</w:t>
+            </w:r>
+          </w:p>
+        </w:tc>
+        <w:tc>
+          <w:tcPr>
+            <w:tcW w:type="dxa" w:w="1344"/>
+            <w:shd w:val="clear" w:color="auto" w:fill="92400e"/>
+          </w:tcPr>
+          <w:p>
+            <w:pPr>
+              <w:jc w:val="center"/>
+            </w:pPr>
+            <w:r>
+              <w:rPr>
+                <w:color w:val="FFFFFF"/>
+                <w:sz w:val="18"/>
+              </w:rPr>
+              <w:t>●</w:t>
+            </w:r>
+          </w:p>
+        </w:tc>
+        <w:tc>
+          <w:tcPr>
+            <w:tcW w:type="dxa" w:w="1344"/>
+            <w:shd w:val="clear" w:color="auto" w:fill="92400e"/>
+          </w:tcPr>
+          <w:p>
+            <w:pPr>
+              <w:jc w:val="center"/>
+            </w:pPr>
+            <w:r>
+              <w:rPr>
+                <w:color w:val="FFFFFF"/>
+                <w:sz w:val="18"/>
+              </w:rPr>
+              <w:t>●</w:t>
+            </w:r>
+          </w:p>
+        </w:tc>
+        <w:tc>
+          <w:tcPr>
+            <w:tcW w:type="dxa" w:w="1344"/>
+            <w:shd w:val="clear" w:color="auto" w:fill="92400e"/>
+          </w:tcPr>
+          <w:p>
+            <w:pPr>
+              <w:jc w:val="center"/>
+            </w:pPr>
+            <w:r>
+              <w:rPr>
+                <w:color w:val="FFFFFF"/>
+                <w:sz w:val="18"/>
+              </w:rPr>
+              <w:t>●</w:t>
+            </w:r>
+          </w:p>
+        </w:tc>
+        <w:tc>
+          <w:tcPr>
+            <w:tcW w:type="dxa" w:w="1344"/>
+            <w:shd w:val="clear" w:color="auto" w:fill="ffffff"/>
+          </w:tcPr>
+          <w:p/>
         </w:tc>
       </w:tr>
       <w:tr>
@@ -2844,7 +4039,7 @@
           <w:color w:val="1E3A5F"/>
           <w:sz w:val="34"/>
         </w:rPr>
-        <w:t>5. Commercial Terms</w:t>
+        <w:t>6. Commercial Terms</w:t>
       </w:r>
     </w:p>
     <w:p>
@@ -3257,71 +4452,6 @@
     </w:tbl>
     <w:p>
       <w:pPr>
-        <w:spacing w:before="200" w:after="80"/>
-      </w:pPr>
-      <w:r>
-        <w:rPr>
-          <w:b/>
-          <w:color w:val="2B6CB0"/>
-          <w:sz w:val="26"/>
-        </w:rPr>
-        <w:t>Payment Terms</w:t>
-      </w:r>
-    </w:p>
-    <w:p>
-      <w:pPr>
-        <w:pStyle w:val="ListBullet"/>
-        <w:spacing w:after="60"/>
-        <w:ind w:left="432"/>
-      </w:pPr>
-      <w:r>
-        <w:rPr>
-          <w:sz w:val="21"/>
-        </w:rPr>
-        <w:t>Monthly invoicing — invoice raised on 1st of each month.</w:t>
-      </w:r>
-    </w:p>
-    <w:p>
-      <w:pPr>
-        <w:pStyle w:val="ListBullet"/>
-        <w:spacing w:after="60"/>
-        <w:ind w:left="432"/>
-      </w:pPr>
-      <w:r>
-        <w:rPr>
-          <w:sz w:val="21"/>
-        </w:rPr>
-        <w:t>Payment due within 14 days of invoice date.</w:t>
-      </w:r>
-    </w:p>
-    <w:p>
-      <w:pPr>
-        <w:pStyle w:val="ListBullet"/>
-        <w:spacing w:after="60"/>
-        <w:ind w:left="432"/>
-      </w:pPr>
-      <w:r>
-        <w:rPr>
-          <w:sz w:val="21"/>
-        </w:rPr>
-        <w:t>On-site travel and accommodation expenses invoiced monthly at actuals with receipts.</w:t>
-      </w:r>
-    </w:p>
-    <w:p>
-      <w:pPr>
-        <w:pStyle w:val="ListBullet"/>
-        <w:spacing w:after="60"/>
-        <w:ind w:left="432"/>
-      </w:pPr>
-      <w:r>
-        <w:rPr>
-          <w:sz w:val="21"/>
-        </w:rPr>
-        <w:t>Scope changes beyond agreed modules quoted separately.</w:t>
-      </w:r>
-    </w:p>
-    <w:p>
-      <w:pPr>
         <w:spacing w:before="320" w:after="120"/>
       </w:pPr>
       <w:r>
@@ -3330,7 +4460,7 @@
           <w:color w:val="1E3A5F"/>
           <w:sz w:val="34"/>
         </w:rPr>
-        <w:t>6. Assumptions &amp; Exclusions</w:t>
+        <w:t>7. Assumptions &amp; Exclusions</w:t>
       </w:r>
     </w:p>
     <w:p>
@@ -3354,6 +4484,7 @@
       </w:pPr>
       <w:r>
         <w:rPr>
+          <w:b w:val="0"/>
           <w:sz w:val="21"/>
         </w:rPr>
         <w:t>Client provides access to Oracle Fusion ERP (non-production for dev, production for go-live).</w:t>
@@ -3367,6 +4498,7 @@
       </w:pPr>
       <w:r>
         <w:rPr>
+          <w:b w:val="0"/>
           <w:sz w:val="21"/>
         </w:rPr>
         <w:t>Oracle APEX REST services and BIP reports available and configured.</w:t>
@@ -3380,9 +4512,10 @@
       </w:pPr>
       <w:r>
         <w:rPr>
+          <w:b w:val="0"/>
           <w:sz w:val="21"/>
         </w:rPr>
-        <w:t>Windows 10/11 workstations available for the desktop WMS application.</w:t>
+        <w:t>Windows 10/11 workstations available for the WMS desktop application.</w:t>
       </w:r>
     </w:p>
     <w:p>
@@ -3393,6 +4526,7 @@
       </w:pPr>
       <w:r>
         <w:rPr>
+          <w:b w:val="0"/>
           <w:sz w:val="21"/>
         </w:rPr>
         <w:t>Dedicated contact available for requirements clarification within 1 business day.</w:t>
@@ -3406,6 +4540,21 @@
       </w:pPr>
       <w:r>
         <w:rPr>
+          <w:b w:val="0"/>
+          <w:sz w:val="21"/>
+        </w:rPr>
+        <w:t>For Warehouse Structure: physical warehouse survey (zones, aisles, bays, bins) completed by client team before Step 1 kickoff.</w:t>
+      </w:r>
+    </w:p>
+    <w:p>
+      <w:pPr>
+        <w:pStyle w:val="ListBullet"/>
+        <w:spacing w:after="60"/>
+        <w:ind w:left="432"/>
+      </w:pPr>
+      <w:r>
+        <w:rPr>
+          <w:b w:val="0"/>
           <w:sz w:val="21"/>
         </w:rPr>
         <w:t>Existing WMS codebase (javeedin/graysWMSwebviewnew) continues as the base.</w:t>
@@ -3432,6 +4581,7 @@
       </w:pPr>
       <w:r>
         <w:rPr>
+          <w:b w:val="0"/>
           <w:sz w:val="21"/>
         </w:rPr>
         <w:t>Oracle Fusion ERP licencing, configuration, or administration.</w:t>
@@ -3445,6 +4595,7 @@
       </w:pPr>
       <w:r>
         <w:rPr>
+          <w:b w:val="0"/>
           <w:sz w:val="21"/>
         </w:rPr>
         <w:t>Infrastructure, hosting, or cloud services.</w:t>
@@ -3458,6 +4609,7 @@
       </w:pPr>
       <w:r>
         <w:rPr>
+          <w:b w:val="0"/>
           <w:sz w:val="21"/>
         </w:rPr>
         <w:t>Third-party integrations not listed in this proposal.</w:t>
@@ -3471,9 +4623,24 @@
       </w:pPr>
       <w:r>
         <w:rPr>
+          <w:b w:val="0"/>
           <w:sz w:val="21"/>
         </w:rPr>
         <w:t>Data migration from legacy systems (quoted separately if required).</w:t>
+      </w:r>
+    </w:p>
+    <w:p>
+      <w:pPr>
+        <w:pStyle w:val="ListBullet"/>
+        <w:spacing w:after="60"/>
+        <w:ind w:left="432"/>
+      </w:pPr>
+      <w:r>
+        <w:rPr>
+          <w:b w:val="0"/>
+          <w:sz w:val="21"/>
+        </w:rPr>
+        <w:t>Option A (Fusion Locators) — this proposal covers Option B only; Option A can be quoted separately for Phase 3.</w:t>
       </w:r>
     </w:p>
     <w:p>
@@ -3486,7 +4653,7 @@
           <w:color w:val="1E3A5F"/>
           <w:sz w:val="34"/>
         </w:rPr>
-        <w:t>7. Next Steps</w:t>
+        <w:t>8. Next Steps</w:t>
       </w:r>
     </w:p>
     <w:p>
@@ -3497,9 +4664,10 @@
       </w:pPr>
       <w:r>
         <w:rPr>
+          <w:b w:val="0"/>
           <w:sz w:val="21"/>
         </w:rPr>
-        <w:t>Step 1: Review and approve this proposal.</w:t>
+        <w:t>Step 1: Approve this proposal and confirm start date.</w:t>
       </w:r>
     </w:p>
     <w:p>
@@ -3510,9 +4678,10 @@
       </w:pPr>
       <w:r>
         <w:rPr>
+          <w:b w:val="0"/>
           <w:sz w:val="21"/>
         </w:rPr>
-        <w:t>Step 2: Sign engagement letter and confirm start date.</w:t>
+        <w:t>Step 2: Architecture decision: confirm Option B (WMS-Managed Locators) for Warehouse Structure.</w:t>
       </w:r>
     </w:p>
     <w:p>
@@ -3523,9 +4692,10 @@
       </w:pPr>
       <w:r>
         <w:rPr>
+          <w:b w:val="0"/>
           <w:sz w:val="21"/>
         </w:rPr>
-        <w:t>Step 3: Kick-off meeting (remote) — agree module priority order.</w:t>
+        <w:t>Step 3: Warehouse survey: Operations team to walk and document zone/aisle/bin naming convention.</w:t>
       </w:r>
     </w:p>
     <w:p>
@@ -3536,9 +4706,10 @@
       </w:pPr>
       <w:r>
         <w:rPr>
+          <w:b w:val="0"/>
           <w:sz w:val="21"/>
         </w:rPr>
-        <w:t>Step 4: Schedule on-site dates for Months 3 &amp; 4.</w:t>
+        <w:t>Step 4: Kick-off meeting (remote) — agree module priority order.</w:t>
       </w:r>
     </w:p>
     <w:p>
@@ -3549,9 +4720,24 @@
       </w:pPr>
       <w:r>
         <w:rPr>
+          <w:b w:val="0"/>
           <w:sz w:val="21"/>
         </w:rPr>
-        <w:t>Step 5: Development begins — first module (Phase 1 completion + Warehouse Structure) delivered within 4 weeks of kick-off.</w:t>
+        <w:t>Step 5: Schedule on-site dates for Months 3 &amp; 4.</w:t>
+      </w:r>
+    </w:p>
+    <w:p>
+      <w:pPr>
+        <w:pStyle w:val="ListBullet"/>
+        <w:spacing w:after="60"/>
+        <w:ind w:left="432"/>
+      </w:pPr>
+      <w:r>
+        <w:rPr>
+          <w:b w:val="0"/>
+          <w:sz w:val="21"/>
+        </w:rPr>
+        <w:t>Step 6: Development begins — Phase 1 completion items delivered within 4 weeks of kick-off.</w:t>
       </w:r>
     </w:p>
     <w:p>

</xml_diff>